<commit_message>
Subiendo actualización al informe
</commit_message>
<xml_diff>
--- a/PROYECTO FINAL/INFORME FINAL.docx
+++ b/PROYECTO FINAL/INFORME FINAL.docx
@@ -1166,7 +1166,7 @@
         </w:rPr>
         <w:fldChar w:fldCharType="separate"/>
       </w:r>
-      <w:hyperlink w:anchor="_Toc232516157" w:history="1">
+      <w:hyperlink w:anchor="_Toc232690649" w:history="1">
         <w:r>
           <w:rPr>
             <w:rStyle w:val="Hipervnculo"/>
@@ -1193,7 +1193,7 @@
             <w:noProof/>
             <w:webHidden/>
           </w:rPr>
-          <w:instrText xml:space="preserve"> PAGEREF _Toc232516157 \h </w:instrText>
+          <w:instrText xml:space="preserve"> PAGEREF _Toc232690649 \h </w:instrText>
         </w:r>
         <w:r>
           <w:rPr>
@@ -1240,7 +1240,7 @@
           <w14:ligatures w14:val="standardContextual"/>
         </w:rPr>
       </w:pPr>
-      <w:hyperlink w:anchor="_Toc232516158" w:history="1">
+      <w:hyperlink w:anchor="_Toc232690650" w:history="1">
         <w:r>
           <w:rPr>
             <w:rStyle w:val="Hipervnculo"/>
@@ -1285,7 +1285,7 @@
             <w:noProof/>
             <w:webHidden/>
           </w:rPr>
-          <w:instrText xml:space="preserve"> PAGEREF _Toc232516158 \h </w:instrText>
+          <w:instrText xml:space="preserve"> PAGEREF _Toc232690650 \h </w:instrText>
         </w:r>
         <w:r>
           <w:rPr>
@@ -1332,7 +1332,7 @@
           <w14:ligatures w14:val="standardContextual"/>
         </w:rPr>
       </w:pPr>
-      <w:hyperlink w:anchor="_Toc232516159" w:history="1">
+      <w:hyperlink w:anchor="_Toc232690651" w:history="1">
         <w:r>
           <w:rPr>
             <w:rStyle w:val="Hipervnculo"/>
@@ -1377,7 +1377,7 @@
             <w:noProof/>
             <w:webHidden/>
           </w:rPr>
-          <w:instrText xml:space="preserve"> PAGEREF _Toc232516159 \h </w:instrText>
+          <w:instrText xml:space="preserve"> PAGEREF _Toc232690651 \h </w:instrText>
         </w:r>
         <w:r>
           <w:rPr>
@@ -1424,7 +1424,7 @@
           <w14:ligatures w14:val="standardContextual"/>
         </w:rPr>
       </w:pPr>
-      <w:hyperlink w:anchor="_Toc232516160" w:history="1">
+      <w:hyperlink w:anchor="_Toc232690652" w:history="1">
         <w:r>
           <w:rPr>
             <w:rStyle w:val="Hipervnculo"/>
@@ -1469,7 +1469,7 @@
             <w:noProof/>
             <w:webHidden/>
           </w:rPr>
-          <w:instrText xml:space="preserve"> PAGEREF _Toc232516160 \h </w:instrText>
+          <w:instrText xml:space="preserve"> PAGEREF _Toc232690652 \h </w:instrText>
         </w:r>
         <w:r>
           <w:rPr>
@@ -1516,7 +1516,7 @@
           <w14:ligatures w14:val="standardContextual"/>
         </w:rPr>
       </w:pPr>
-      <w:hyperlink w:anchor="_Toc232516161" w:history="1">
+      <w:hyperlink w:anchor="_Toc232690653" w:history="1">
         <w:r>
           <w:rPr>
             <w:rStyle w:val="Hipervnculo"/>
@@ -1561,7 +1561,7 @@
             <w:noProof/>
             <w:webHidden/>
           </w:rPr>
-          <w:instrText xml:space="preserve"> PAGEREF _Toc232516161 \h </w:instrText>
+          <w:instrText xml:space="preserve"> PAGEREF _Toc232690653 \h </w:instrText>
         </w:r>
         <w:r>
           <w:rPr>
@@ -1581,7 +1581,7 @@
             <w:noProof/>
             <w:webHidden/>
           </w:rPr>
-          <w:t>4</w:t>
+          <w:t>6</w:t>
         </w:r>
         <w:r>
           <w:rPr>
@@ -1608,7 +1608,7 @@
           <w14:ligatures w14:val="standardContextual"/>
         </w:rPr>
       </w:pPr>
-      <w:hyperlink w:anchor="_Toc232516162" w:history="1">
+      <w:hyperlink w:anchor="_Toc232690654" w:history="1">
         <w:r>
           <w:rPr>
             <w:rStyle w:val="Hipervnculo"/>
@@ -1653,7 +1653,7 @@
             <w:noProof/>
             <w:webHidden/>
           </w:rPr>
-          <w:instrText xml:space="preserve"> PAGEREF _Toc232516162 \h </w:instrText>
+          <w:instrText xml:space="preserve"> PAGEREF _Toc232690654 \h </w:instrText>
         </w:r>
         <w:r>
           <w:rPr>
@@ -1673,7 +1673,7 @@
             <w:noProof/>
             <w:webHidden/>
           </w:rPr>
-          <w:t>5</w:t>
+          <w:t>8</w:t>
         </w:r>
         <w:r>
           <w:rPr>
@@ -1700,7 +1700,7 @@
           <w14:ligatures w14:val="standardContextual"/>
         </w:rPr>
       </w:pPr>
-      <w:hyperlink w:anchor="_Toc232516163" w:history="1">
+      <w:hyperlink w:anchor="_Toc232690655" w:history="1">
         <w:r>
           <w:rPr>
             <w:rStyle w:val="Hipervnculo"/>
@@ -1724,7 +1724,7 @@
             <w:rStyle w:val="Hipervnculo"/>
             <w:noProof/>
           </w:rPr>
-          <w:t>Análisis de causalidad del contexto problemático</w:t>
+          <w:t>Problema delimitado</w:t>
         </w:r>
         <w:r>
           <w:rPr>
@@ -1745,7 +1745,7 @@
             <w:noProof/>
             <w:webHidden/>
           </w:rPr>
-          <w:instrText xml:space="preserve"> PAGEREF _Toc232516163 \h </w:instrText>
+          <w:instrText xml:space="preserve"> PAGEREF _Toc232690655 \h </w:instrText>
         </w:r>
         <w:r>
           <w:rPr>
@@ -1765,7 +1765,7 @@
             <w:noProof/>
             <w:webHidden/>
           </w:rPr>
-          <w:t>5</w:t>
+          <w:t>8</w:t>
         </w:r>
         <w:r>
           <w:rPr>
@@ -1792,7 +1792,7 @@
           <w14:ligatures w14:val="standardContextual"/>
         </w:rPr>
       </w:pPr>
-      <w:hyperlink w:anchor="_Toc232516164" w:history="1">
+      <w:hyperlink w:anchor="_Toc232690656" w:history="1">
         <w:r>
           <w:rPr>
             <w:rStyle w:val="Hipervnculo"/>
@@ -1816,7 +1816,7 @@
             <w:rStyle w:val="Hipervnculo"/>
             <w:noProof/>
           </w:rPr>
-          <w:t>Contexto problemático</w:t>
+          <w:t>Objetivo General</w:t>
         </w:r>
         <w:r>
           <w:rPr>
@@ -1837,7 +1837,7 @@
             <w:noProof/>
             <w:webHidden/>
           </w:rPr>
-          <w:instrText xml:space="preserve"> PAGEREF _Toc232516164 \h </w:instrText>
+          <w:instrText xml:space="preserve"> PAGEREF _Toc232690656 \h </w:instrText>
         </w:r>
         <w:r>
           <w:rPr>
@@ -1857,7 +1857,7 @@
             <w:noProof/>
             <w:webHidden/>
           </w:rPr>
-          <w:t>5</w:t>
+          <w:t>9</w:t>
         </w:r>
         <w:r>
           <w:rPr>
@@ -1884,7 +1884,7 @@
           <w14:ligatures w14:val="standardContextual"/>
         </w:rPr>
       </w:pPr>
-      <w:hyperlink w:anchor="_Toc232516165" w:history="1">
+      <w:hyperlink w:anchor="_Toc232690657" w:history="1">
         <w:r>
           <w:rPr>
             <w:rStyle w:val="Hipervnculo"/>
@@ -1908,7 +1908,7 @@
             <w:rStyle w:val="Hipervnculo"/>
             <w:noProof/>
           </w:rPr>
-          <w:t>Definición del problema</w:t>
+          <w:t>Objetivos Específicos</w:t>
         </w:r>
         <w:r>
           <w:rPr>
@@ -1929,7 +1929,7 @@
             <w:noProof/>
             <w:webHidden/>
           </w:rPr>
-          <w:instrText xml:space="preserve"> PAGEREF _Toc232516165 \h </w:instrText>
+          <w:instrText xml:space="preserve"> PAGEREF _Toc232690657 \h </w:instrText>
         </w:r>
         <w:r>
           <w:rPr>
@@ -1949,7 +1949,99 @@
             <w:noProof/>
             <w:webHidden/>
           </w:rPr>
-          <w:t>5</w:t>
+          <w:t>9</w:t>
+        </w:r>
+        <w:r>
+          <w:rPr>
+            <w:noProof/>
+            <w:webHidden/>
+          </w:rPr>
+          <w:fldChar w:fldCharType="end"/>
+        </w:r>
+      </w:hyperlink>
+    </w:p>
+    <w:p>
+      <w:pPr>
+        <w:pStyle w:val="TDC3"/>
+        <w:tabs>
+          <w:tab w:val="left" w:pos="1200"/>
+          <w:tab w:val="right" w:leader="dot" w:pos="9016"/>
+        </w:tabs>
+        <w:rPr>
+          <w:rFonts w:asciiTheme="minorHAnsi" w:eastAsiaTheme="minorEastAsia" w:hAnsiTheme="minorHAnsi"/>
+          <w:noProof/>
+          <w:kern w:val="2"/>
+          <w:szCs w:val="24"/>
+          <w:lang w:eastAsia="es-PE"/>
+          <w14:ligatures w14:val="standardContextual"/>
+        </w:rPr>
+      </w:pPr>
+      <w:hyperlink w:anchor="_Toc232690658" w:history="1">
+        <w:r>
+          <w:rPr>
+            <w:rStyle w:val="Hipervnculo"/>
+            <w:noProof/>
+          </w:rPr>
+          <w:t>2.4.</w:t>
+        </w:r>
+        <w:r>
+          <w:rPr>
+            <w:rFonts w:asciiTheme="minorHAnsi" w:eastAsiaTheme="minorEastAsia" w:hAnsiTheme="minorHAnsi"/>
+            <w:noProof/>
+            <w:kern w:val="2"/>
+            <w:szCs w:val="24"/>
+            <w:lang w:eastAsia="es-PE"/>
+            <w14:ligatures w14:val="standardContextual"/>
+          </w:rPr>
+          <w:tab/>
+        </w:r>
+        <w:r>
+          <w:rPr>
+            <w:rStyle w:val="Hipervnculo"/>
+            <w:noProof/>
+          </w:rPr>
+          <w:t>Mapa de Empatía</w:t>
+        </w:r>
+        <w:r>
+          <w:rPr>
+            <w:noProof/>
+            <w:webHidden/>
+          </w:rPr>
+          <w:tab/>
+        </w:r>
+        <w:r>
+          <w:rPr>
+            <w:noProof/>
+            <w:webHidden/>
+          </w:rPr>
+          <w:fldChar w:fldCharType="begin"/>
+        </w:r>
+        <w:r>
+          <w:rPr>
+            <w:noProof/>
+            <w:webHidden/>
+          </w:rPr>
+          <w:instrText xml:space="preserve"> PAGEREF _Toc232690658 \h </w:instrText>
+        </w:r>
+        <w:r>
+          <w:rPr>
+            <w:noProof/>
+            <w:webHidden/>
+          </w:rPr>
+        </w:r>
+        <w:r>
+          <w:rPr>
+            <w:noProof/>
+            <w:webHidden/>
+          </w:rPr>
+          <w:fldChar w:fldCharType="separate"/>
+        </w:r>
+        <w:r>
+          <w:rPr>
+            <w:noProof/>
+            <w:webHidden/>
+          </w:rPr>
+          <w:t>11</w:t>
         </w:r>
         <w:r>
           <w:rPr>
@@ -1975,7 +2067,7 @@
           <w14:ligatures w14:val="standardContextual"/>
         </w:rPr>
       </w:pPr>
-      <w:hyperlink w:anchor="_Toc232516166" w:history="1">
+      <w:hyperlink w:anchor="_Toc232690659" w:history="1">
         <w:r>
           <w:rPr>
             <w:rStyle w:val="Hipervnculo"/>
@@ -2002,7 +2094,7 @@
             <w:noProof/>
             <w:webHidden/>
           </w:rPr>
-          <w:instrText xml:space="preserve"> PAGEREF _Toc232516166 \h </w:instrText>
+          <w:instrText xml:space="preserve"> PAGEREF _Toc232690659 \h </w:instrText>
         </w:r>
         <w:r>
           <w:rPr>
@@ -2022,7 +2114,7 @@
             <w:noProof/>
             <w:webHidden/>
           </w:rPr>
-          <w:t>6</w:t>
+          <w:t>12</w:t>
         </w:r>
         <w:r>
           <w:rPr>
@@ -2049,7 +2141,7 @@
           <w14:ligatures w14:val="standardContextual"/>
         </w:rPr>
       </w:pPr>
-      <w:hyperlink w:anchor="_Toc232516167" w:history="1">
+      <w:hyperlink w:anchor="_Toc232690660" w:history="1">
         <w:r>
           <w:rPr>
             <w:rStyle w:val="Hipervnculo"/>
@@ -2094,7 +2186,7 @@
             <w:noProof/>
             <w:webHidden/>
           </w:rPr>
-          <w:instrText xml:space="preserve"> PAGEREF _Toc232516167 \h </w:instrText>
+          <w:instrText xml:space="preserve"> PAGEREF _Toc232690660 \h </w:instrText>
         </w:r>
         <w:r>
           <w:rPr>
@@ -2114,7 +2206,7 @@
             <w:noProof/>
             <w:webHidden/>
           </w:rPr>
-          <w:t>6</w:t>
+          <w:t>12</w:t>
         </w:r>
         <w:r>
           <w:rPr>
@@ -2141,7 +2233,7 @@
           <w14:ligatures w14:val="standardContextual"/>
         </w:rPr>
       </w:pPr>
-      <w:hyperlink w:anchor="_Toc232516168" w:history="1">
+      <w:hyperlink w:anchor="_Toc232690661" w:history="1">
         <w:r>
           <w:rPr>
             <w:rStyle w:val="Hipervnculo"/>
@@ -2186,7 +2278,7 @@
             <w:noProof/>
             <w:webHidden/>
           </w:rPr>
-          <w:instrText xml:space="preserve"> PAGEREF _Toc232516168 \h </w:instrText>
+          <w:instrText xml:space="preserve"> PAGEREF _Toc232690661 \h </w:instrText>
         </w:r>
         <w:r>
           <w:rPr>
@@ -2206,7 +2298,7 @@
             <w:noProof/>
             <w:webHidden/>
           </w:rPr>
-          <w:t>6</w:t>
+          <w:t>12</w:t>
         </w:r>
         <w:r>
           <w:rPr>
@@ -2233,7 +2325,7 @@
           <w14:ligatures w14:val="standardContextual"/>
         </w:rPr>
       </w:pPr>
-      <w:hyperlink w:anchor="_Toc232516169" w:history="1">
+      <w:hyperlink w:anchor="_Toc232690662" w:history="1">
         <w:r>
           <w:rPr>
             <w:rStyle w:val="Hipervnculo"/>
@@ -2278,7 +2370,7 @@
             <w:noProof/>
             <w:webHidden/>
           </w:rPr>
-          <w:instrText xml:space="preserve"> PAGEREF _Toc232516169 \h </w:instrText>
+          <w:instrText xml:space="preserve"> PAGEREF _Toc232690662 \h </w:instrText>
         </w:r>
         <w:r>
           <w:rPr>
@@ -2298,7 +2390,7 @@
             <w:noProof/>
             <w:webHidden/>
           </w:rPr>
-          <w:t>6</w:t>
+          <w:t>12</w:t>
         </w:r>
         <w:r>
           <w:rPr>
@@ -2324,7 +2416,7 @@
           <w14:ligatures w14:val="standardContextual"/>
         </w:rPr>
       </w:pPr>
-      <w:hyperlink w:anchor="_Toc232516170" w:history="1">
+      <w:hyperlink w:anchor="_Toc232690663" w:history="1">
         <w:r>
           <w:rPr>
             <w:rStyle w:val="Hipervnculo"/>
@@ -2351,7 +2443,7 @@
             <w:noProof/>
             <w:webHidden/>
           </w:rPr>
-          <w:instrText xml:space="preserve"> PAGEREF _Toc232516170 \h </w:instrText>
+          <w:instrText xml:space="preserve"> PAGEREF _Toc232690663 \h </w:instrText>
         </w:r>
         <w:r>
           <w:rPr>
@@ -2371,7 +2463,7 @@
             <w:noProof/>
             <w:webHidden/>
           </w:rPr>
-          <w:t>7</w:t>
+          <w:t>13</w:t>
         </w:r>
         <w:r>
           <w:rPr>
@@ -2398,7 +2490,7 @@
           <w14:ligatures w14:val="standardContextual"/>
         </w:rPr>
       </w:pPr>
-      <w:hyperlink w:anchor="_Toc232516171" w:history="1">
+      <w:hyperlink w:anchor="_Toc232690664" w:history="1">
         <w:r>
           <w:rPr>
             <w:rStyle w:val="Hipervnculo"/>
@@ -2443,7 +2535,7 @@
             <w:noProof/>
             <w:webHidden/>
           </w:rPr>
-          <w:instrText xml:space="preserve"> PAGEREF _Toc232516171 \h </w:instrText>
+          <w:instrText xml:space="preserve"> PAGEREF _Toc232690664 \h </w:instrText>
         </w:r>
         <w:r>
           <w:rPr>
@@ -2463,7 +2555,7 @@
             <w:noProof/>
             <w:webHidden/>
           </w:rPr>
-          <w:t>7</w:t>
+          <w:t>13</w:t>
         </w:r>
         <w:r>
           <w:rPr>
@@ -2521,7 +2613,7 @@
       <w:pPr>
         <w:pStyle w:val="Ttulo1"/>
       </w:pPr>
-      <w:bookmarkStart w:id="0" w:name="_Toc232516157"/>
+      <w:bookmarkStart w:id="0" w:name="_Toc232690649"/>
       <w:r>
         <w:lastRenderedPageBreak/>
         <w:t>CAPÍTULO I</w:t>
@@ -2532,7 +2624,7 @@
       <w:pPr>
         <w:pStyle w:val="Ttulo2"/>
       </w:pPr>
-      <w:bookmarkStart w:id="1" w:name="_Toc232516158"/>
+      <w:bookmarkStart w:id="1" w:name="_Toc232690650"/>
       <w:r>
         <w:t xml:space="preserve">Identificación </w:t>
       </w:r>
@@ -2567,7 +2659,7 @@
       <w:r>
         <w:t xml:space="preserve"> </w:t>
       </w:r>
-      <w:bookmarkStart w:id="2" w:name="_Toc232516159"/>
+      <w:bookmarkStart w:id="2" w:name="_Toc232690651"/>
       <w:r>
         <w:t>Limitaciones identificadas</w:t>
       </w:r>
@@ -2632,13 +2724,7 @@
         <w:t xml:space="preserve">Incertidumbre de ubicación: </w:t>
       </w:r>
       <w:r>
-        <w:t xml:space="preserve">Al cambiar constantemente de feria, el público fidelizado no sabe </w:t>
-      </w:r>
-      <w:r>
-        <w:t>dónde</w:t>
-      </w:r>
-      <w:r>
-        <w:t xml:space="preserve"> encontrar el negocio la siguiente semana</w:t>
+        <w:t>Al cambiar constantemente de feria, el público fidelizado no sabe dónde encontrar el negocio la siguiente semana</w:t>
       </w:r>
       <w:r>
         <w:t xml:space="preserve"> y el horario.</w:t>
@@ -2674,7 +2760,7 @@
       <w:r>
         <w:t xml:space="preserve"> </w:t>
       </w:r>
-      <w:bookmarkStart w:id="3" w:name="_Toc232516160"/>
+      <w:bookmarkStart w:id="3" w:name="_Toc232690652"/>
       <w:r>
         <w:t>Entrevistas Breves a los Representantes</w:t>
       </w:r>
@@ -2747,30 +2833,10 @@
     <w:p>
       <w:pPr>
         <w:pStyle w:val="APATMA"/>
-        <w:numPr>
-          <w:ilvl w:val="0"/>
-          <w:numId w:val="12"/>
-        </w:numPr>
-        <w:rPr>
-          <w:b/>
-          <w:bCs/>
-        </w:rPr>
-      </w:pPr>
-      <w:r>
-        <w:rPr>
-          <w:b/>
-          <w:bCs/>
-        </w:rPr>
-        <w:t>¿Qué limitaciones tecnológicas enfrentas?</w:t>
-      </w:r>
-    </w:p>
-    <w:p>
-      <w:pPr>
-        <w:pStyle w:val="APATMA"/>
         <w:ind w:left="1429" w:firstLine="0"/>
       </w:pPr>
       <w:r>
-        <w:t>“En el taller paramos ocupados cosiendo y cortando. No sabemos programar ni usar herramientas complejas. Yo uso mi celular y una laptop de gama media.”</w:t>
+        <w:t xml:space="preserve">"El cliente siempre nos pregunta: '¿Dónde van a estar el próximo fin de semana?'. Necesitamos un espacio claro donde se listen las ferias activas, las fechas y las ubicaciones exactas con mapas sencillos."  </w:t>
       </w:r>
     </w:p>
     <w:p>
@@ -2790,7 +2856,7 @@
           <w:b/>
           <w:bCs/>
         </w:rPr>
-        <w:t>¿Qué información prioritaria desean mostrar?</w:t>
+        <w:t>¿Qué limitaciones tecnológicas enfrentas?</w:t>
       </w:r>
     </w:p>
     <w:p>
@@ -2799,6 +2865,44 @@
         <w:ind w:left="1429" w:firstLine="0"/>
       </w:pPr>
       <w:r>
+        <w:t>“En el taller paramos ocupados cosiendo y cortando. No sabemos programar ni usar herramientas complejas. Yo uso mi celular y una laptop de gama media.”</w:t>
+      </w:r>
+    </w:p>
+    <w:p>
+      <w:pPr>
+        <w:pStyle w:val="APATMA"/>
+        <w:ind w:left="1429" w:firstLine="0"/>
+      </w:pPr>
+      <w:r>
+        <w:t>"Atendiendo en la feria no puedo estar respondiendo mensajes largos todo el día. Necesito que el cliente vea el stock disponible y que el proceso de pedido sea directo para atenderlo rápido desde mi celular."</w:t>
+      </w:r>
+    </w:p>
+    <w:p>
+      <w:pPr>
+        <w:pStyle w:val="APATMA"/>
+        <w:numPr>
+          <w:ilvl w:val="0"/>
+          <w:numId w:val="12"/>
+        </w:numPr>
+        <w:rPr>
+          <w:b/>
+          <w:bCs/>
+        </w:rPr>
+      </w:pPr>
+      <w:r>
+        <w:rPr>
+          <w:b/>
+          <w:bCs/>
+        </w:rPr>
+        <w:t>¿Qué información prioritaria desean mostrar?</w:t>
+      </w:r>
+    </w:p>
+    <w:p>
+      <w:pPr>
+        <w:pStyle w:val="APATMA"/>
+        <w:ind w:left="1429" w:firstLine="0"/>
+      </w:pPr>
+      <w:r>
         <w:t>“Fotos reales de las mochilas</w:t>
       </w:r>
       <w:r>
@@ -2811,52 +2915,230 @@
     <w:p>
       <w:pPr>
         <w:pStyle w:val="APATMA"/>
-      </w:pPr>
-      <w:r>
-        <w:rPr>
-          <w:b/>
-          <w:bCs/>
-        </w:rPr>
-        <w:t>Entrevista 2:</w:t>
-      </w:r>
-      <w:r>
-        <w:t xml:space="preserve"> Cliente de tercera edad </w:t>
-      </w:r>
-      <w:r>
+        <w:ind w:left="1429" w:firstLine="0"/>
+      </w:pPr>
+      <w:r>
+        <w:t>"El calendario de ferias actualizado de cada mes y un botón rápido para coordinar la compra por WhatsApp o dejar los datos de su pedido."</w:t>
+      </w:r>
+    </w:p>
+    <w:p>
+      <w:pPr>
+        <w:pStyle w:val="APATMA"/>
         <w:rPr>
           <w:i/>
           <w:iCs/>
         </w:rPr>
-        <w:t>(María, 68 años)</w:t>
-      </w:r>
-    </w:p>
-    <w:p>
-      <w:pPr>
-        <w:pStyle w:val="APATMA"/>
-      </w:pPr>
-      <w:r>
-        <w:rPr>
-          <w:b/>
-          <w:bCs/>
-        </w:rPr>
-        <w:t>Entrevista 3:</w:t>
-      </w:r>
-      <w:r>
-        <w:t xml:space="preserve"> Cliente juvenil </w:t>
+      </w:pPr>
+      <w:r>
+        <w:rPr>
+          <w:b/>
+          <w:bCs/>
+        </w:rPr>
+        <w:t>Entrevista 2:</w:t>
+      </w:r>
+      <w:r>
+        <w:t xml:space="preserve"> Cliente de tercera edad </w:t>
       </w:r>
       <w:r>
         <w:rPr>
           <w:i/>
           <w:iCs/>
         </w:rPr>
+        <w:t>(María, 68 años)</w:t>
+      </w:r>
+    </w:p>
+    <w:p>
+      <w:pPr>
+        <w:pStyle w:val="APATMA"/>
+        <w:numPr>
+          <w:ilvl w:val="0"/>
+          <w:numId w:val="12"/>
+        </w:numPr>
+      </w:pPr>
+      <w:r>
+        <w:rPr>
+          <w:b/>
+          <w:bCs/>
+        </w:rPr>
+        <w:t>¿Cuáles son sus necesidades al buscar un producto como una mochila?</w:t>
+      </w:r>
+      <w:r>
+        <w:t xml:space="preserve"> </w:t>
+      </w:r>
+    </w:p>
+    <w:p>
+      <w:pPr>
+        <w:pStyle w:val="APATMA"/>
+        <w:ind w:left="1429" w:firstLine="0"/>
+      </w:pPr>
+      <w:r>
+        <w:t>"A veces busco mochilas buenas y reforzadas para mis nietos que van al colegio o la universidad, o una pequeña para mí cuando salgo a caminar. Me gusta tocar la tela para saber si va a durar."</w:t>
+      </w:r>
+    </w:p>
+    <w:p>
+      <w:pPr>
+        <w:pStyle w:val="APATMA"/>
+        <w:numPr>
+          <w:ilvl w:val="0"/>
+          <w:numId w:val="12"/>
+        </w:numPr>
+      </w:pPr>
+      <w:r>
+        <w:rPr>
+          <w:b/>
+          <w:bCs/>
+        </w:rPr>
+        <w:lastRenderedPageBreak/>
+        <w:t>¿Qué limitaciones tecnológicas enfrenta en su día a día?</w:t>
+      </w:r>
+      <w:r>
+        <w:t xml:space="preserve"> </w:t>
+      </w:r>
+    </w:p>
+    <w:p>
+      <w:pPr>
+        <w:pStyle w:val="APATMA"/>
+        <w:ind w:left="1429" w:firstLine="0"/>
+      </w:pPr>
+      <w:r>
+        <w:t>"Tengo un celular que me regaló mi hijo. Uso WhatsApp para hablar con la familia, pero me cuesta mucho usar páginas web porque las letras son chiquititas y si me sale mucha publicidad o ventanas flotantes, me asusto y las cierro. No sé usar pasarelas de pago con tarjeta, me da desconfianza."</w:t>
+      </w:r>
+    </w:p>
+    <w:p>
+      <w:pPr>
+        <w:pStyle w:val="APATMA"/>
+        <w:numPr>
+          <w:ilvl w:val="0"/>
+          <w:numId w:val="12"/>
+        </w:numPr>
+      </w:pPr>
+      <w:r>
+        <w:rPr>
+          <w:b/>
+          <w:bCs/>
+        </w:rPr>
+        <w:t>¿Qué información desea ver en la plataforma y cómo le gustaría interactuar?</w:t>
+      </w:r>
+      <w:r>
+        <w:t xml:space="preserve"> </w:t>
+      </w:r>
+    </w:p>
+    <w:p>
+      <w:pPr>
+        <w:pStyle w:val="APATMA"/>
+        <w:ind w:left="1429" w:firstLine="0"/>
+      </w:pPr>
+      <w:r>
+        <w:t>"Quiero ver fotos grandes y claras de las mochilas. Sobre todo, necesito saber exactamente en qué feria y en qué distrito van a estar el fin de semana, con una dirección fácil de leer. Me gustaría un botón grande para poder llamar por teléfono o mandar un mensaje de WhatsApp directo si me pierdo al buscar el puesto."</w:t>
+      </w:r>
+    </w:p>
+    <w:p>
+      <w:pPr>
+        <w:pStyle w:val="APATMA"/>
+        <w:rPr>
+          <w:i/>
+          <w:iCs/>
+        </w:rPr>
+      </w:pPr>
+      <w:r>
+        <w:rPr>
+          <w:b/>
+          <w:bCs/>
+        </w:rPr>
+        <w:t>Entrevista 3:</w:t>
+      </w:r>
+      <w:r>
+        <w:t xml:space="preserve"> Cliente juvenil </w:t>
+      </w:r>
+      <w:r>
+        <w:rPr>
+          <w:i/>
+          <w:iCs/>
+        </w:rPr>
         <w:t>(Eduardo, 25 años)</w:t>
       </w:r>
     </w:p>
     <w:p>
       <w:pPr>
+        <w:pStyle w:val="APATMA"/>
+        <w:numPr>
+          <w:ilvl w:val="0"/>
+          <w:numId w:val="12"/>
+        </w:numPr>
+      </w:pPr>
+      <w:r>
+        <w:rPr>
+          <w:b/>
+          <w:bCs/>
+        </w:rPr>
+        <w:t>¿Cuáles son sus necesidades al buscar un producto como una mochila?</w:t>
+      </w:r>
+    </w:p>
+    <w:p>
+      <w:pPr>
+        <w:pStyle w:val="APATMA"/>
+        <w:ind w:left="1429" w:firstLine="0"/>
+      </w:pPr>
+      <w:r>
+        <w:t>"Busco mochilas que sean estéticas, pero sobre todo funcionales. Necesito compartimentos acolchados para mi laptop de 15 pulgadas, bolsillos ocultos antirrobo y que el material sea impermeable porque me muevo en moto o transporte público por todo Lima."</w:t>
+      </w:r>
+    </w:p>
+    <w:p>
+      <w:pPr>
+        <w:pStyle w:val="APATMA"/>
+        <w:numPr>
+          <w:ilvl w:val="0"/>
+          <w:numId w:val="12"/>
+        </w:numPr>
+      </w:pPr>
+      <w:r>
+        <w:rPr>
+          <w:b/>
+          <w:bCs/>
+        </w:rPr>
+        <w:t>¿Qué limitaciones tecnológicas enfrenta en su día a día?</w:t>
+      </w:r>
+    </w:p>
+    <w:p>
+      <w:pPr>
+        <w:pStyle w:val="APATMA"/>
+        <w:ind w:left="1429" w:firstLine="0"/>
+      </w:pPr>
+      <w:r>
+        <w:t>"Uso un celular de gama media. No tengo problemas con la tecnología, pero sí con el tiempo. Si una página web demora más de 3 segundos en cargar o el diseño es antiguo y no se adapta bien a mi pantalla, la dejo de inmediato."</w:t>
+      </w:r>
+    </w:p>
+    <w:p>
+      <w:pPr>
+        <w:pStyle w:val="APATMA"/>
+        <w:numPr>
+          <w:ilvl w:val="0"/>
+          <w:numId w:val="12"/>
+        </w:numPr>
+      </w:pPr>
+      <w:r>
+        <w:rPr>
+          <w:b/>
+          <w:bCs/>
+        </w:rPr>
+        <w:lastRenderedPageBreak/>
+        <w:t>¿Qué información desea ver en la plataforma y cómo le gustaría interactuar?</w:t>
+      </w:r>
+    </w:p>
+    <w:p>
+      <w:pPr>
+        <w:pStyle w:val="APATMA"/>
+        <w:ind w:left="1429" w:firstLine="0"/>
+      </w:pPr>
+      <w:r>
+        <w:t>"Quiero un catálogo rápido con filtros eficientes: poder separar por tamaño, por precio o saber si la mochila es de producción nacional o importada. Me interesa ver el stock real en tiempo real. Si veo una que me gusta, quiero saber en qué feria están hoy mismo para ir a comprarla directamente, o poder separarla con un clic."</w:t>
+      </w:r>
+    </w:p>
+    <w:p>
+      <w:pPr>
         <w:pStyle w:val="Ttulo3"/>
       </w:pPr>
-      <w:bookmarkStart w:id="4" w:name="_Toc232516161"/>
+      <w:bookmarkStart w:id="4" w:name="_Toc232690653"/>
       <w:r>
         <w:t>Perfiles de usuario</w:t>
       </w:r>
@@ -2975,6 +3257,7 @@
           <w:p>
             <w:pPr>
               <w:pStyle w:val="APATMA"/>
+              <w:spacing w:line="360" w:lineRule="auto"/>
               <w:ind w:firstLine="0"/>
             </w:pPr>
             <w:r>
@@ -3005,6 +3288,7 @@
           <w:p>
             <w:pPr>
               <w:pStyle w:val="APATMA"/>
+              <w:spacing w:line="360" w:lineRule="auto"/>
               <w:ind w:firstLine="0"/>
             </w:pPr>
             <w:r>
@@ -3066,8 +3350,24 @@
           <w:p>
             <w:pPr>
               <w:pStyle w:val="APATMA"/>
+              <w:spacing w:line="360" w:lineRule="auto"/>
               <w:ind w:firstLine="0"/>
             </w:pPr>
+            <w:r>
+              <w:t xml:space="preserve">Necesitamos un catálogo digital limpio donde la </w:t>
+            </w:r>
+            <w:r>
+              <w:t xml:space="preserve">se muestra la legitimidad y calidad de nuestros productos. Además de </w:t>
+            </w:r>
+            <w:r>
+              <w:t xml:space="preserve">un </w:t>
+            </w:r>
+            <w:r>
+              <w:t>apartado</w:t>
+            </w:r>
+            <w:r>
+              <w:t xml:space="preserve"> donde se listen las ferias activas, las fechas y las ubicaciones exactas con mapas sencillos.</w:t>
+            </w:r>
           </w:p>
         </w:tc>
       </w:tr>
@@ -3093,8 +3393,16 @@
           <w:p>
             <w:pPr>
               <w:pStyle w:val="APATMA"/>
+              <w:spacing w:line="360" w:lineRule="auto"/>
               <w:ind w:firstLine="0"/>
             </w:pPr>
+            <w:r>
+              <w:t xml:space="preserve">Falta de tiempo, interfaces web colapsadas de publicidad o muy </w:t>
+            </w:r>
+            <w:r>
+              <w:lastRenderedPageBreak/>
+              <w:t>complejas de entender desde pantallas móviles</w:t>
+            </w:r>
           </w:p>
         </w:tc>
       </w:tr>
@@ -3115,11 +3423,279 @@
           <w:b/>
           <w:bCs/>
         </w:rPr>
-        <w:lastRenderedPageBreak/>
         <w:t>Perfil 2:</w:t>
       </w:r>
       <w:r>
+        <w:t xml:space="preserve"> El cliente Final (Tercera Edad)</w:t>
+      </w:r>
+    </w:p>
+    <w:tbl>
+      <w:tblPr>
+        <w:tblStyle w:val="Tablaconcuadrcula"/>
+        <w:tblW w:w="0" w:type="auto"/>
+        <w:tblInd w:w="988" w:type="dxa"/>
+        <w:tblLook w:val="04A0" w:firstRow="1" w:lastRow="0" w:firstColumn="1" w:lastColumn="0" w:noHBand="0" w:noVBand="1"/>
+      </w:tblPr>
+      <w:tblGrid>
+        <w:gridCol w:w="4110"/>
+        <w:gridCol w:w="3918"/>
+      </w:tblGrid>
+      <w:tr>
+        <w:trPr>
+          <w:trHeight w:val="570"/>
+        </w:trPr>
+        <w:tc>
+          <w:tcPr>
+            <w:tcW w:w="4110" w:type="dxa"/>
+            <w:vAlign w:val="center"/>
+          </w:tcPr>
+          <w:p>
+            <w:pPr>
+              <w:pStyle w:val="APATMA"/>
+              <w:spacing w:line="240" w:lineRule="auto"/>
+              <w:ind w:firstLine="0"/>
+              <w:jc w:val="center"/>
+              <w:rPr>
+                <w:b/>
+                <w:bCs/>
+              </w:rPr>
+            </w:pPr>
+            <w:r>
+              <w:rPr>
+                <w:b/>
+                <w:bCs/>
+              </w:rPr>
+              <w:t>Atributo</w:t>
+            </w:r>
+          </w:p>
+        </w:tc>
+        <w:tc>
+          <w:tcPr>
+            <w:tcW w:w="3918" w:type="dxa"/>
+            <w:vAlign w:val="center"/>
+          </w:tcPr>
+          <w:p>
+            <w:pPr>
+              <w:pStyle w:val="APATMA"/>
+              <w:spacing w:line="240" w:lineRule="auto"/>
+              <w:ind w:firstLine="0"/>
+              <w:jc w:val="center"/>
+              <w:rPr>
+                <w:b/>
+                <w:bCs/>
+              </w:rPr>
+            </w:pPr>
+            <w:r>
+              <w:rPr>
+                <w:b/>
+                <w:bCs/>
+              </w:rPr>
+              <w:t>Detalle</w:t>
+            </w:r>
+          </w:p>
+        </w:tc>
+      </w:tr>
+      <w:tr>
+        <w:tc>
+          <w:tcPr>
+            <w:tcW w:w="4110" w:type="dxa"/>
+          </w:tcPr>
+          <w:p>
+            <w:pPr>
+              <w:pStyle w:val="APATMA"/>
+              <w:ind w:firstLine="0"/>
+            </w:pPr>
+            <w:r>
+              <w:t>Nombre</w:t>
+            </w:r>
+          </w:p>
+        </w:tc>
+        <w:tc>
+          <w:tcPr>
+            <w:tcW w:w="3918" w:type="dxa"/>
+          </w:tcPr>
+          <w:p>
+            <w:pPr>
+              <w:pStyle w:val="APATMA"/>
+              <w:spacing w:line="360" w:lineRule="auto"/>
+              <w:ind w:firstLine="0"/>
+            </w:pPr>
+            <w:r>
+              <w:t xml:space="preserve">María </w:t>
+            </w:r>
+          </w:p>
+        </w:tc>
+      </w:tr>
+      <w:tr>
+        <w:tc>
+          <w:tcPr>
+            <w:tcW w:w="4110" w:type="dxa"/>
+          </w:tcPr>
+          <w:p>
+            <w:pPr>
+              <w:pStyle w:val="APATMA"/>
+              <w:ind w:firstLine="0"/>
+            </w:pPr>
+            <w:r>
+              <w:t>Edad</w:t>
+            </w:r>
+          </w:p>
+        </w:tc>
+        <w:tc>
+          <w:tcPr>
+            <w:tcW w:w="3918" w:type="dxa"/>
+          </w:tcPr>
+          <w:p>
+            <w:pPr>
+              <w:pStyle w:val="APATMA"/>
+              <w:spacing w:line="360" w:lineRule="auto"/>
+              <w:ind w:firstLine="0"/>
+            </w:pPr>
+            <w:r>
+              <w:t>68 años</w:t>
+            </w:r>
+          </w:p>
+        </w:tc>
+      </w:tr>
+      <w:tr>
+        <w:tc>
+          <w:tcPr>
+            <w:tcW w:w="4110" w:type="dxa"/>
+          </w:tcPr>
+          <w:p>
+            <w:pPr>
+              <w:pStyle w:val="APATMA"/>
+              <w:ind w:firstLine="0"/>
+            </w:pPr>
+            <w:r>
+              <w:t xml:space="preserve">Rol </w:t>
+            </w:r>
+          </w:p>
+        </w:tc>
+        <w:tc>
+          <w:tcPr>
+            <w:tcW w:w="3918" w:type="dxa"/>
+          </w:tcPr>
+          <w:p>
+            <w:pPr>
+              <w:pStyle w:val="APATMA"/>
+              <w:spacing w:line="360" w:lineRule="auto"/>
+              <w:ind w:firstLine="0"/>
+            </w:pPr>
+            <w:r>
+              <w:t>Comprado / Cliente</w:t>
+            </w:r>
+          </w:p>
+        </w:tc>
+      </w:tr>
+      <w:tr>
+        <w:tc>
+          <w:tcPr>
+            <w:tcW w:w="4110" w:type="dxa"/>
+            <w:vAlign w:val="center"/>
+          </w:tcPr>
+          <w:p>
+            <w:pPr>
+              <w:pStyle w:val="APATMA"/>
+              <w:ind w:firstLine="0"/>
+              <w:jc w:val="left"/>
+            </w:pPr>
+            <w:r>
+              <w:t>Necesidades</w:t>
+            </w:r>
+          </w:p>
+        </w:tc>
+        <w:tc>
+          <w:tcPr>
+            <w:tcW w:w="3918" w:type="dxa"/>
+          </w:tcPr>
+          <w:p>
+            <w:pPr>
+              <w:pStyle w:val="APATMA"/>
+              <w:spacing w:line="360" w:lineRule="auto"/>
+              <w:ind w:firstLine="0"/>
+            </w:pPr>
+            <w:r>
+              <w:t>Encontrar mochilas duraderas para la universidad, verificar precios y saber exactamente en qué feria del distrito estará el emprendimiento para recoger su producto.</w:t>
+            </w:r>
+          </w:p>
+        </w:tc>
+      </w:tr>
+      <w:tr>
+        <w:tc>
+          <w:tcPr>
+            <w:tcW w:w="4110" w:type="dxa"/>
+            <w:vAlign w:val="center"/>
+          </w:tcPr>
+          <w:p>
+            <w:pPr>
+              <w:pStyle w:val="APATMA"/>
+              <w:ind w:firstLine="0"/>
+              <w:jc w:val="left"/>
+            </w:pPr>
+            <w:r>
+              <w:t>Frustraciones</w:t>
+            </w:r>
+          </w:p>
+        </w:tc>
+        <w:tc>
+          <w:tcPr>
+            <w:tcW w:w="3918" w:type="dxa"/>
+          </w:tcPr>
+          <w:p>
+            <w:pPr>
+              <w:pStyle w:val="APATMA"/>
+              <w:spacing w:line="360" w:lineRule="auto"/>
+              <w:ind w:firstLine="0"/>
+            </w:pPr>
+            <w:r>
+              <w:t>Páginas web muy complejas, información de contacto desactualizada o mapas confusos.</w:t>
+            </w:r>
+          </w:p>
+        </w:tc>
+      </w:tr>
+    </w:tbl>
+    <w:p>
+      <w:pPr>
+        <w:pStyle w:val="APATMA"/>
+        <w:ind w:left="360"/>
+        <w:rPr>
+          <w:b/>
+          <w:bCs/>
+        </w:rPr>
+      </w:pPr>
+    </w:p>
+    <w:p>
+      <w:pPr>
+        <w:pStyle w:val="APATMA"/>
+        <w:ind w:left="360"/>
+      </w:pPr>
+      <w:r>
+        <w:rPr>
+          <w:b/>
+          <w:bCs/>
+        </w:rPr>
+        <w:t xml:space="preserve">Perfil </w:t>
+      </w:r>
+      <w:r>
+        <w:rPr>
+          <w:b/>
+          <w:bCs/>
+        </w:rPr>
+        <w:t>3</w:t>
+      </w:r>
+      <w:r>
+        <w:rPr>
+          <w:b/>
+          <w:bCs/>
+        </w:rPr>
+        <w:t>:</w:t>
+      </w:r>
+      <w:r>
         <w:t xml:space="preserve"> El cliente Final</w:t>
+      </w:r>
+      <w:r>
+        <w:t xml:space="preserve"> (Juvenil)</w:t>
       </w:r>
     </w:p>
     <w:tbl>
@@ -3245,10 +3821,7 @@
               <w:ind w:firstLine="0"/>
             </w:pPr>
             <w:r>
-              <w:t>25</w:t>
-            </w:r>
-            <w:r>
-              <w:t xml:space="preserve"> años</w:t>
+              <w:t>25 años</w:t>
             </w:r>
           </w:p>
         </w:tc>
@@ -3279,7 +3852,16 @@
               <w:ind w:firstLine="0"/>
             </w:pPr>
             <w:r>
-              <w:t>Comprado / Cliente</w:t>
+              <w:t>C</w:t>
+            </w:r>
+            <w:r>
+              <w:t>liente</w:t>
+            </w:r>
+            <w:r>
+              <w:t xml:space="preserve"> / </w:t>
+            </w:r>
+            <w:r>
+              <w:t>Usuario web intensivo</w:t>
             </w:r>
           </w:p>
         </w:tc>
@@ -3312,7 +3894,11 @@
               <w:ind w:firstLine="0"/>
             </w:pPr>
             <w:r>
-              <w:t>Encontrar mochilas duraderas para la universidad, verificar precios y saber exactamente en qué feria del distrito estará el emprendimiento para recoger su producto.</w:t>
+              <w:t xml:space="preserve">Optimización de tiempo. Requiere un buscador interno eficaz, especificaciones técnicas claras (capacidad en litros, pulgadas de </w:t>
+            </w:r>
+            <w:r>
+              <w:lastRenderedPageBreak/>
+              <w:t>laptop) y la certeza de que el producto está disponible antes de ir a la feria.</w:t>
             </w:r>
           </w:p>
         </w:tc>
@@ -3330,6 +3916,7 @@
               <w:jc w:val="left"/>
             </w:pPr>
             <w:r>
+              <w:lastRenderedPageBreak/>
               <w:t>Frustraciones</w:t>
             </w:r>
           </w:p>
@@ -3345,190 +3932,460 @@
               <w:ind w:firstLine="0"/>
             </w:pPr>
             <w:r>
-              <w:t>Páginas web que no cargan rápido en la calle, información de contacto desactualizada o mapas confusos.</w:t>
+              <w:t>Catálogos desactualizados sin stock real, lentitud de carga de imágenes en dispositivos móviles, falta de especificaciones técnicas.</w:t>
             </w:r>
           </w:p>
         </w:tc>
       </w:tr>
     </w:tbl>
+    <w:p/>
+    <w:p>
+      <w:pPr>
+        <w:pStyle w:val="Ttulo2"/>
+      </w:pPr>
+      <w:bookmarkStart w:id="5" w:name="_Toc232690654"/>
+      <w:r>
+        <w:t>Justificación técnica y ética</w:t>
+      </w:r>
+      <w:bookmarkEnd w:id="5"/>
+    </w:p>
+    <w:p>
+      <w:pPr>
+        <w:pStyle w:val="Ttulo3"/>
+      </w:pPr>
+      <w:r>
+        <w:t xml:space="preserve"> </w:t>
+      </w:r>
+      <w:bookmarkStart w:id="6" w:name="_Toc232690655"/>
+      <w:r>
+        <w:t>Problema delimitado</w:t>
+      </w:r>
+      <w:bookmarkEnd w:id="6"/>
+    </w:p>
     <w:p>
       <w:pPr>
         <w:pStyle w:val="APATMA"/>
-        <w:ind w:left="360"/>
-      </w:pPr>
-    </w:p>
-    <w:p/>
-    <w:p>
-      <w:pPr>
-        <w:pStyle w:val="Ttulo2"/>
-      </w:pPr>
-      <w:bookmarkStart w:id="5" w:name="_Toc232516162"/>
-      <w:r>
-        <w:t>Justificación técnica y ética</w:t>
-      </w:r>
-      <w:bookmarkEnd w:id="5"/>
+      </w:pPr>
+      <w:r>
+        <w:t xml:space="preserve">El emprendimiento local objeto de este proyecto se dedica a la confección y comercialización de mochilas </w:t>
+      </w:r>
+      <w:r>
+        <w:rPr>
+          <w:b/>
+          <w:bCs/>
+        </w:rPr>
+        <w:t>(tanto de producción nacional propia como importadas)</w:t>
+      </w:r>
+      <w:r>
+        <w:t xml:space="preserve"> en Lima Metropolitana. A pesar de contar con un taller operativo de producción, el negocio carece de un local comercial o punto de venta físico fijo, lo que restringe sus canales de venta exclusivamente a la participación itinerante en ferias organizadas por las municipalidades.</w:t>
+      </w:r>
+    </w:p>
+    <w:p>
+      <w:pPr>
+        <w:pStyle w:val="APATMA"/>
+      </w:pPr>
+      <w:r>
+        <w:t>Esta dependencia absoluta del canal físico itinerante genera tres problemáticas críticas y delimitadas:</w:t>
+      </w:r>
+    </w:p>
+    <w:p>
+      <w:pPr>
+        <w:pStyle w:val="APATMA"/>
+        <w:numPr>
+          <w:ilvl w:val="0"/>
+          <w:numId w:val="13"/>
+        </w:numPr>
+      </w:pPr>
+      <w:r>
+        <w:rPr>
+          <w:b/>
+          <w:bCs/>
+        </w:rPr>
+        <w:t xml:space="preserve">Invisibilidad </w:t>
+      </w:r>
+      <w:proofErr w:type="spellStart"/>
+      <w:r>
+        <w:rPr>
+          <w:b/>
+          <w:bCs/>
+        </w:rPr>
+        <w:t>post-feria</w:t>
+      </w:r>
+      <w:proofErr w:type="spellEnd"/>
+      <w:r>
+        <w:rPr>
+          <w:b/>
+          <w:bCs/>
+        </w:rPr>
+        <w:t xml:space="preserve"> y pérdida de clientes:</w:t>
+      </w:r>
+      <w:r>
+        <w:t xml:space="preserve"> Una vez que la feria concluye, el vínculo comercial con el cliente se rompe. Los usuarios interesados o recurrentes no disponen de una plataforma centralizada para ubicar el nuevo punto de atención del negocio.  </w:t>
+      </w:r>
+    </w:p>
+    <w:p>
+      <w:pPr>
+        <w:pStyle w:val="APATMA"/>
+        <w:numPr>
+          <w:ilvl w:val="0"/>
+          <w:numId w:val="13"/>
+        </w:numPr>
+      </w:pPr>
+      <w:r>
+        <w:rPr>
+          <w:b/>
+          <w:bCs/>
+        </w:rPr>
+        <w:t>Inexistencia de un catálogo unificado:</w:t>
+      </w:r>
+      <w:r>
+        <w:t xml:space="preserve"> Al convivir dos líneas de producto con ventajas competitivas distintas (la durabilidad de la costura nacional frente a la variedad del producto importado), la falta de una vitrina digital impide que el público compare especificaciones técnicas (capacidad, materiales) antes de la compra.  </w:t>
+      </w:r>
+    </w:p>
+    <w:p>
+      <w:pPr>
+        <w:pStyle w:val="APATMA"/>
+        <w:numPr>
+          <w:ilvl w:val="0"/>
+          <w:numId w:val="13"/>
+        </w:numPr>
+      </w:pPr>
+      <w:r>
+        <w:rPr>
+          <w:b/>
+          <w:bCs/>
+        </w:rPr>
+        <w:lastRenderedPageBreak/>
+        <w:t>Vulnerabilidad comercial y operativa:</w:t>
+      </w:r>
+      <w:r>
+        <w:t xml:space="preserve"> El negocio está sujeto a factores externos no controlables (clima, afluencia física de la feria, asignación de cupos municipales). Al no contar con un sistema automatizado para recibir pedidos fuera del horario de feria, se limita severamente el crecimiento de sus ingresos mensuales.  </w:t>
+      </w:r>
     </w:p>
     <w:p>
       <w:pPr>
         <w:pStyle w:val="Ttulo3"/>
       </w:pPr>
-      <w:bookmarkStart w:id="6" w:name="_Toc232516163"/>
-      <w:r>
-        <w:t>Análisis de causalidad del contexto problemático</w:t>
-      </w:r>
-      <w:bookmarkEnd w:id="6"/>
-    </w:p>
-    <w:p>
-      <w:pPr>
-        <w:pStyle w:val="Prrafodelista"/>
-        <w:spacing w:line="360" w:lineRule="auto"/>
-        <w:ind w:left="1080"/>
-        <w:jc w:val="both"/>
+      <w:r>
+        <w:t xml:space="preserve"> </w:t>
+      </w:r>
+      <w:bookmarkStart w:id="7" w:name="_Toc232690656"/>
+      <w:r>
+        <w:t>Objetivo General</w:t>
+      </w:r>
+      <w:bookmarkEnd w:id="7"/>
+    </w:p>
+    <w:p>
+      <w:pPr>
+        <w:pStyle w:val="APATMA"/>
+      </w:pPr>
+      <w:r>
+        <w:t xml:space="preserve">Desarrollar e implementar una aplicación web funcional de arquitectura cliente-servidor mediante un </w:t>
+      </w:r>
+      <w:proofErr w:type="spellStart"/>
+      <w:r>
+        <w:t>front-end</w:t>
+      </w:r>
+      <w:proofErr w:type="spellEnd"/>
+      <w:r>
+        <w:t xml:space="preserve"> responsivo (HTML5, CSS3, JavaScript y Bootstrap) y un back-</w:t>
+      </w:r>
+      <w:proofErr w:type="spellStart"/>
+      <w:r>
+        <w:t>end</w:t>
+      </w:r>
+      <w:proofErr w:type="spellEnd"/>
+      <w:r>
+        <w:t xml:space="preserve"> en Node.js con Express.js y persistencia en archivos JSON, con el fin de sistematizar los procesos de promoción, exhibición de catálogos y difusión cronológica de ferias itinerantes para un emprendimiento local de confección e importación de mochilas en Lima Metropolitana, garantizando la accesibilidad digital y un rendimiento óptimo en dispositivos móviles de gama media.</w:t>
+      </w:r>
+    </w:p>
+    <w:p>
+      <w:pPr>
+        <w:pStyle w:val="Ttulo3"/>
+      </w:pPr>
+      <w:r>
+        <w:t xml:space="preserve"> </w:t>
+      </w:r>
+      <w:bookmarkStart w:id="8" w:name="_Toc232690657"/>
+      <w:r>
+        <w:t>Objetivos</w:t>
+      </w:r>
+      <w:r>
+        <w:t xml:space="preserve"> Específicos</w:t>
+      </w:r>
+      <w:bookmarkEnd w:id="8"/>
+    </w:p>
+    <w:p>
+      <w:pPr>
+        <w:pStyle w:val="APATMA"/>
+      </w:pPr>
+      <w:r>
+        <w:t xml:space="preserve">Para resolver la problemática delimitada, se establecen los siguientes objetivos concretos, medibles y alineados con el alcance del desafío técnico:  </w:t>
+      </w:r>
+    </w:p>
+    <w:p>
+      <w:pPr>
+        <w:pStyle w:val="APATMA"/>
+        <w:numPr>
+          <w:ilvl w:val="0"/>
+          <w:numId w:val="14"/>
+        </w:numPr>
+      </w:pPr>
+      <w:r>
+        <w:rPr>
+          <w:b/>
+          <w:bCs/>
+        </w:rPr>
+        <w:t>Objetivo 1</w:t>
+      </w:r>
+      <w:r>
+        <w:t xml:space="preserve"> </w:t>
+      </w:r>
+      <w:r>
+        <w:rPr>
+          <w:i/>
+          <w:iCs/>
+        </w:rPr>
+        <w:t>(Funcionalidad Front-</w:t>
+      </w:r>
+      <w:proofErr w:type="spellStart"/>
+      <w:r>
+        <w:rPr>
+          <w:i/>
+          <w:iCs/>
+        </w:rPr>
+        <w:t>end</w:t>
+      </w:r>
+      <w:proofErr w:type="spellEnd"/>
+      <w:r>
+        <w:rPr>
+          <w:i/>
+          <w:iCs/>
+        </w:rPr>
+        <w:t>)</w:t>
+      </w:r>
+      <w:r>
+        <w:t>: Diseñar e implementar una interfaz web interactiva y responsiva (</w:t>
+      </w:r>
+      <w:proofErr w:type="spellStart"/>
+      <w:r>
+        <w:t>mobile-first</w:t>
+      </w:r>
+      <w:proofErr w:type="spellEnd"/>
+      <w:r>
+        <w:t xml:space="preserve">) utilizando HTML5, CSS3 y Bootstrap 5, que reduzca la fricción de navegación y cargue eficientemente en dispositivos móviles de gama media.  </w:t>
+      </w:r>
+    </w:p>
+    <w:p>
+      <w:pPr>
+        <w:pStyle w:val="APATMA"/>
+        <w:numPr>
+          <w:ilvl w:val="0"/>
+          <w:numId w:val="14"/>
+        </w:numPr>
+      </w:pPr>
+      <w:r>
+        <w:rPr>
+          <w:b/>
+          <w:bCs/>
+        </w:rPr>
+        <w:t>Objetivo 2</w:t>
+      </w:r>
+      <w:r>
+        <w:t xml:space="preserve"> </w:t>
+      </w:r>
+      <w:r>
+        <w:rPr>
+          <w:i/>
+          <w:iCs/>
+        </w:rPr>
+        <w:t>(Módulo de Geolocalización e Información)</w:t>
+      </w:r>
+      <w:r>
+        <w:t xml:space="preserve">: Desarrollar un apartado dinámico y cronológico para la gestión de ferias que centralice las ubicaciones, fechas y enlaces de Google </w:t>
+      </w:r>
+      <w:proofErr w:type="spellStart"/>
+      <w:r>
+        <w:t>Maps</w:t>
+      </w:r>
+      <w:proofErr w:type="spellEnd"/>
+      <w:r>
+        <w:t xml:space="preserve">, logrando que el 100% de los </w:t>
+      </w:r>
+      <w:r>
+        <w:lastRenderedPageBreak/>
+        <w:t xml:space="preserve">usuarios recurrentes puedan localizar el negocio de manera exacta en cualquier momento.  </w:t>
+      </w:r>
+    </w:p>
+    <w:p>
+      <w:pPr>
+        <w:pStyle w:val="APATMA"/>
+        <w:numPr>
+          <w:ilvl w:val="0"/>
+          <w:numId w:val="14"/>
+        </w:numPr>
+      </w:pPr>
+      <w:r>
+        <w:rPr>
+          <w:b/>
+          <w:bCs/>
+        </w:rPr>
+        <w:t>Objetivo 3</w:t>
+      </w:r>
+      <w:r>
+        <w:t xml:space="preserve"> </w:t>
+      </w:r>
+      <w:r>
+        <w:rPr>
+          <w:i/>
+          <w:iCs/>
+        </w:rPr>
+        <w:t>(Persistencia y Lógica Back-</w:t>
+      </w:r>
+      <w:proofErr w:type="spellStart"/>
+      <w:r>
+        <w:rPr>
+          <w:i/>
+          <w:iCs/>
+        </w:rPr>
+        <w:t>end</w:t>
+      </w:r>
+      <w:proofErr w:type="spellEnd"/>
+      <w:r>
+        <w:rPr>
+          <w:i/>
+          <w:iCs/>
+        </w:rPr>
+        <w:t>)</w:t>
+      </w:r>
+      <w:r>
+        <w:t xml:space="preserve">: Configurar un servidor web funcional empleando Node.js y Express.js, estructurando rutas GET para servir el catálogo de mochilas y rutas POST para capturar y almacenar las solicitudes de compra en archivos JSON sin depender de sistemas de bases de datos complejos.  </w:t>
+      </w:r>
+    </w:p>
+    <w:p>
+      <w:pPr>
+        <w:pStyle w:val="APATMA"/>
+        <w:numPr>
+          <w:ilvl w:val="0"/>
+          <w:numId w:val="14"/>
+        </w:numPr>
+      </w:pPr>
+      <w:r>
+        <w:rPr>
+          <w:b/>
+          <w:bCs/>
+        </w:rPr>
+        <w:t xml:space="preserve">Objetivo 4 </w:t>
+      </w:r>
+      <w:r>
+        <w:rPr>
+          <w:i/>
+          <w:iCs/>
+        </w:rPr>
+        <w:t>(Calidad y Accesibilidad)</w:t>
+      </w:r>
+      <w:r>
+        <w:t xml:space="preserve">: Garantizar un índice de accesibilidad y rendimiento web superior a 80 puntos en la evaluación de la herramienta Lighthouse (o WAVE), asegurando tipografías legibles, alto contraste y una navegación estructurada apta para usuarios con diferentes niveles de alfabetización digital.  </w:t>
+      </w:r>
+    </w:p>
+    <w:p>
+      <w:pPr>
         <w:rPr>
           <w:rFonts w:ascii="Times New Roman" w:hAnsi="Times New Roman" w:cs="Times New Roman"/>
+          <w:b/>
+          <w:bCs/>
           <w:sz w:val="24"/>
           <w:szCs w:val="24"/>
         </w:rPr>
       </w:pPr>
-    </w:p>
-    <w:p>
-      <w:pPr>
+      <w:r>
+        <w:br w:type="page"/>
+      </w:r>
+    </w:p>
+    <w:p>
+      <w:pPr>
+        <w:pStyle w:val="Ttulo3"/>
+      </w:pPr>
+      <w:bookmarkStart w:id="9" w:name="_Toc232690658"/>
+      <w:r>
+        <w:lastRenderedPageBreak/>
+        <w:t>Mapa de Empatía</w:t>
+      </w:r>
+      <w:bookmarkEnd w:id="9"/>
+    </w:p>
+    <w:p>
+      <w:pPr>
+        <w:pStyle w:val="APATMA"/>
+      </w:pPr>
+      <w:r>
+        <w:t>Este mapa sintetiza los dolores, necesidades y el entorno del usuario administrador del sistema, justificando el diseño simplificado de la plataforma.</w:t>
+      </w:r>
+    </w:p>
+    <w:p>
+      <w:pPr>
+        <w:ind w:left="708"/>
         <w:rPr>
           <w:rFonts w:ascii="Times New Roman" w:hAnsi="Times New Roman" w:cs="Times New Roman"/>
+          <w:b/>
+          <w:bCs/>
           <w:sz w:val="24"/>
           <w:szCs w:val="24"/>
-          <w:u w:val="single"/>
-        </w:rPr>
-      </w:pPr>
-    </w:p>
-    <w:p>
-      <w:pPr>
-        <w:pStyle w:val="Ttulo3"/>
-      </w:pPr>
-      <w:bookmarkStart w:id="7" w:name="_Toc232516164"/>
-      <w:r>
-        <w:t>Contexto problemático</w:t>
-      </w:r>
-      <w:bookmarkEnd w:id="7"/>
-    </w:p>
-    <w:p>
-      <w:pPr>
-        <w:pStyle w:val="Prrafodelista"/>
-        <w:spacing w:line="360" w:lineRule="auto"/>
-        <w:ind w:left="1080"/>
-        <w:jc w:val="both"/>
+        </w:rPr>
+      </w:pPr>
+      <w:r>
+        <w:rPr>
+          <w:noProof/>
+        </w:rPr>
+        <w:drawing>
+          <wp:inline distT="0" distB="0" distL="0" distR="0" wp14:anchorId="073A6A0C" wp14:editId="3BF623EF">
+            <wp:extent cx="5046784" cy="3785368"/>
+            <wp:effectExtent l="0" t="0" r="1905" b="5715"/>
+            <wp:docPr id="1122972738" name="Imagen 2"/>
+            <wp:cNvGraphicFramePr>
+              <a:graphicFrameLocks xmlns:a="http://schemas.openxmlformats.org/drawingml/2006/main" noChangeAspect="1"/>
+            </wp:cNvGraphicFramePr>
+            <a:graphic xmlns:a="http://schemas.openxmlformats.org/drawingml/2006/main">
+              <a:graphicData uri="http://schemas.openxmlformats.org/drawingml/2006/picture">
+                <pic:pic xmlns:pic="http://schemas.openxmlformats.org/drawingml/2006/picture">
+                  <pic:nvPicPr>
+                    <pic:cNvPr id="1122972738" name="Imagen 1122972738"/>
+                    <pic:cNvPicPr/>
+                  </pic:nvPicPr>
+                  <pic:blipFill>
+                    <a:blip r:embed="rId13">
+                      <a:extLst>
+                        <a:ext uri="{28A0092B-C50C-407E-A947-70E740481C1C}">
+                          <a14:useLocalDpi xmlns:a14="http://schemas.microsoft.com/office/drawing/2010/main" val="0"/>
+                        </a:ext>
+                      </a:extLst>
+                    </a:blip>
+                    <a:stretch>
+                      <a:fillRect/>
+                    </a:stretch>
+                  </pic:blipFill>
+                  <pic:spPr>
+                    <a:xfrm>
+                      <a:off x="0" y="0"/>
+                      <a:ext cx="5058365" cy="3794054"/>
+                    </a:xfrm>
+                    <a:prstGeom prst="rect">
+                      <a:avLst/>
+                    </a:prstGeom>
+                  </pic:spPr>
+                </pic:pic>
+              </a:graphicData>
+            </a:graphic>
+          </wp:inline>
+        </w:drawing>
+      </w:r>
+      <w:r>
         <w:rPr>
           <w:rFonts w:ascii="Times New Roman" w:hAnsi="Times New Roman" w:cs="Times New Roman"/>
+          <w:b/>
+          <w:bCs/>
           <w:sz w:val="24"/>
           <w:szCs w:val="24"/>
         </w:rPr>
-      </w:pPr>
-      <w:r>
-        <w:rPr>
-          <w:rFonts w:ascii="Times New Roman" w:hAnsi="Times New Roman" w:cs="Times New Roman"/>
-          <w:sz w:val="24"/>
-          <w:szCs w:val="24"/>
-        </w:rPr>
-        <w:t>Describe</w:t>
-      </w:r>
-      <w:r>
-        <w:rPr>
-          <w:rFonts w:ascii="Times New Roman" w:hAnsi="Times New Roman" w:cs="Times New Roman"/>
-          <w:sz w:val="24"/>
-          <w:szCs w:val="24"/>
-        </w:rPr>
-        <w:t xml:space="preserve"> el contexto problemático del usuario </w:t>
-      </w:r>
-      <w:r>
-        <w:rPr>
-          <w:rFonts w:ascii="Times New Roman" w:hAnsi="Times New Roman" w:cs="Times New Roman"/>
-          <w:sz w:val="24"/>
-          <w:szCs w:val="24"/>
-        </w:rPr>
-        <w:t>del espacio de socialización</w:t>
-      </w:r>
-      <w:r>
-        <w:rPr>
-          <w:rFonts w:ascii="Times New Roman" w:hAnsi="Times New Roman" w:cs="Times New Roman"/>
-          <w:sz w:val="24"/>
-          <w:szCs w:val="24"/>
-        </w:rPr>
-        <w:t xml:space="preserve">, de lo general </w:t>
-      </w:r>
-      <w:r>
-        <w:rPr>
-          <w:rFonts w:ascii="Times New Roman" w:hAnsi="Times New Roman" w:cs="Times New Roman"/>
-          <w:sz w:val="24"/>
-          <w:szCs w:val="24"/>
-        </w:rPr>
-        <w:t>a lo particular.</w:t>
-      </w:r>
-    </w:p>
-    <w:p>
-      <w:pPr>
-        <w:pStyle w:val="Ttulo3"/>
-      </w:pPr>
-      <w:bookmarkStart w:id="8" w:name="_Toc232516165"/>
-      <w:r>
-        <w:t>Definición del problema</w:t>
-      </w:r>
-      <w:bookmarkEnd w:id="8"/>
-    </w:p>
-    <w:p>
-      <w:pPr>
-        <w:pStyle w:val="Prrafodelista"/>
-        <w:spacing w:line="360" w:lineRule="auto"/>
-        <w:ind w:left="1080"/>
-        <w:jc w:val="both"/>
-        <w:rPr>
-          <w:rFonts w:ascii="Times New Roman" w:hAnsi="Times New Roman" w:cs="Times New Roman"/>
-          <w:sz w:val="24"/>
-          <w:szCs w:val="24"/>
-        </w:rPr>
-      </w:pPr>
-      <w:r>
-        <w:rPr>
-          <w:rFonts w:ascii="Times New Roman" w:hAnsi="Times New Roman" w:cs="Times New Roman"/>
-          <w:sz w:val="24"/>
-          <w:szCs w:val="24"/>
-        </w:rPr>
-        <w:t xml:space="preserve">Formula una pregunta </w:t>
-      </w:r>
-      <w:r>
-        <w:rPr>
-          <w:rFonts w:ascii="Times New Roman" w:hAnsi="Times New Roman" w:cs="Times New Roman"/>
-          <w:sz w:val="24"/>
-          <w:szCs w:val="24"/>
-        </w:rPr>
-        <w:t xml:space="preserve">reto </w:t>
-      </w:r>
-      <w:r>
-        <w:rPr>
-          <w:rFonts w:ascii="Times New Roman" w:hAnsi="Times New Roman" w:cs="Times New Roman"/>
-          <w:sz w:val="24"/>
-          <w:szCs w:val="24"/>
-        </w:rPr>
-        <w:t>que oriente la solución.</w:t>
-      </w:r>
-    </w:p>
-    <w:p>
-      <w:pPr>
-        <w:rPr>
-          <w:rFonts w:ascii="Times New Roman" w:hAnsi="Times New Roman" w:cs="Times New Roman"/>
-          <w:b/>
-          <w:bCs/>
-          <w:sz w:val="24"/>
-          <w:szCs w:val="24"/>
-        </w:rPr>
-      </w:pPr>
-      <w:r>
-        <w:rPr>
-          <w:rFonts w:ascii="Times New Roman" w:hAnsi="Times New Roman" w:cs="Times New Roman"/>
-          <w:b/>
-          <w:bCs/>
-          <w:sz w:val="24"/>
-          <w:szCs w:val="24"/>
-        </w:rPr>
         <w:br w:type="page"/>
       </w:r>
     </w:p>
@@ -3536,22 +4393,22 @@
       <w:pPr>
         <w:pStyle w:val="Ttulo1"/>
       </w:pPr>
-      <w:bookmarkStart w:id="9" w:name="_Toc232516166"/>
+      <w:bookmarkStart w:id="10" w:name="_Toc232690659"/>
       <w:r>
         <w:lastRenderedPageBreak/>
         <w:t>CAPÍTULO II</w:t>
       </w:r>
-      <w:bookmarkEnd w:id="9"/>
+      <w:bookmarkEnd w:id="10"/>
     </w:p>
     <w:p>
       <w:pPr>
         <w:pStyle w:val="Ttulo2"/>
       </w:pPr>
-      <w:bookmarkStart w:id="10" w:name="_Toc232516167"/>
+      <w:bookmarkStart w:id="11" w:name="_Toc232690660"/>
       <w:r>
         <w:t>Arquitectura y tecnologías empleadas</w:t>
       </w:r>
-      <w:bookmarkEnd w:id="10"/>
+      <w:bookmarkEnd w:id="11"/>
     </w:p>
     <w:p>
       <w:pPr>
@@ -3577,11 +4434,11 @@
       <w:pPr>
         <w:pStyle w:val="Ttulo2"/>
       </w:pPr>
-      <w:bookmarkStart w:id="11" w:name="_Toc232516168"/>
+      <w:bookmarkStart w:id="12" w:name="_Toc232690661"/>
       <w:r>
         <w:t>Descripción de funcionalidades</w:t>
       </w:r>
-      <w:bookmarkEnd w:id="11"/>
+      <w:bookmarkEnd w:id="12"/>
     </w:p>
     <w:p>
       <w:pPr>
@@ -3631,11 +4488,11 @@
       <w:pPr>
         <w:pStyle w:val="Ttulo2"/>
       </w:pPr>
-      <w:bookmarkStart w:id="12" w:name="_Toc232516169"/>
+      <w:bookmarkStart w:id="13" w:name="_Toc232690662"/>
       <w:r>
         <w:t>Buenas prácticas aplicadas</w:t>
       </w:r>
-      <w:bookmarkEnd w:id="12"/>
+      <w:bookmarkEnd w:id="13"/>
     </w:p>
     <w:p>
       <w:pPr>
@@ -3720,22 +4577,22 @@
       <w:pPr>
         <w:pStyle w:val="Ttulo1"/>
       </w:pPr>
-      <w:bookmarkStart w:id="13" w:name="_Toc232516170"/>
+      <w:bookmarkStart w:id="14" w:name="_Toc232690663"/>
       <w:r>
         <w:lastRenderedPageBreak/>
         <w:t>CAPÍTULO III</w:t>
       </w:r>
-      <w:bookmarkEnd w:id="13"/>
+      <w:bookmarkEnd w:id="14"/>
     </w:p>
     <w:p>
       <w:pPr>
         <w:pStyle w:val="Ttulo2"/>
       </w:pPr>
-      <w:bookmarkStart w:id="14" w:name="_Toc232516171"/>
+      <w:bookmarkStart w:id="15" w:name="_Toc232690664"/>
       <w:r>
         <w:t>Conclusiones y aprendizajes</w:t>
       </w:r>
-      <w:bookmarkEnd w:id="14"/>
+      <w:bookmarkEnd w:id="15"/>
     </w:p>
     <w:p>
       <w:pPr>
@@ -3793,7 +4650,7 @@
       </w:pPr>
     </w:p>
     <w:sectPr>
-      <w:headerReference w:type="default" r:id="rId13"/>
+      <w:headerReference w:type="default" r:id="rId14"/>
       <w:pgSz w:w="11906" w:h="16838"/>
       <w:pgMar w:top="1440" w:right="1440" w:bottom="1440" w:left="1440" w:header="708" w:footer="708" w:gutter="0"/>
       <w:cols w:space="708"/>
@@ -4817,6 +5674,119 @@
     </w:lvl>
   </w:abstractNum>
   <w:abstractNum w:abstractNumId="7" w15:restartNumberingAfterBreak="0">
+    <w:nsid w:val="2FC7349F"/>
+    <w:multiLevelType w:val="hybridMultilevel"/>
+    <w:tmpl w:val="113EC026"/>
+    <w:lvl w:ilvl="0" w:tplc="280A0001">
+      <w:start w:val="1"/>
+      <w:numFmt w:val="bullet"/>
+      <w:lvlText w:val=""/>
+      <w:lvlJc w:val="left"/>
+      <w:pPr>
+        <w:ind w:left="1429" w:hanging="360"/>
+      </w:pPr>
+      <w:rPr>
+        <w:rFonts w:ascii="Symbol" w:hAnsi="Symbol" w:hint="default"/>
+      </w:rPr>
+    </w:lvl>
+    <w:lvl w:ilvl="1" w:tplc="280A0003" w:tentative="1">
+      <w:start w:val="1"/>
+      <w:numFmt w:val="bullet"/>
+      <w:lvlText w:val="o"/>
+      <w:lvlJc w:val="left"/>
+      <w:pPr>
+        <w:ind w:left="2149" w:hanging="360"/>
+      </w:pPr>
+      <w:rPr>
+        <w:rFonts w:ascii="Courier New" w:hAnsi="Courier New" w:cs="Courier New" w:hint="default"/>
+      </w:rPr>
+    </w:lvl>
+    <w:lvl w:ilvl="2" w:tplc="280A0005" w:tentative="1">
+      <w:start w:val="1"/>
+      <w:numFmt w:val="bullet"/>
+      <w:lvlText w:val=""/>
+      <w:lvlJc w:val="left"/>
+      <w:pPr>
+        <w:ind w:left="2869" w:hanging="360"/>
+      </w:pPr>
+      <w:rPr>
+        <w:rFonts w:ascii="Wingdings" w:hAnsi="Wingdings" w:hint="default"/>
+      </w:rPr>
+    </w:lvl>
+    <w:lvl w:ilvl="3" w:tplc="280A0001" w:tentative="1">
+      <w:start w:val="1"/>
+      <w:numFmt w:val="bullet"/>
+      <w:lvlText w:val=""/>
+      <w:lvlJc w:val="left"/>
+      <w:pPr>
+        <w:ind w:left="3589" w:hanging="360"/>
+      </w:pPr>
+      <w:rPr>
+        <w:rFonts w:ascii="Symbol" w:hAnsi="Symbol" w:hint="default"/>
+      </w:rPr>
+    </w:lvl>
+    <w:lvl w:ilvl="4" w:tplc="280A0003" w:tentative="1">
+      <w:start w:val="1"/>
+      <w:numFmt w:val="bullet"/>
+      <w:lvlText w:val="o"/>
+      <w:lvlJc w:val="left"/>
+      <w:pPr>
+        <w:ind w:left="4309" w:hanging="360"/>
+      </w:pPr>
+      <w:rPr>
+        <w:rFonts w:ascii="Courier New" w:hAnsi="Courier New" w:cs="Courier New" w:hint="default"/>
+      </w:rPr>
+    </w:lvl>
+    <w:lvl w:ilvl="5" w:tplc="280A0005" w:tentative="1">
+      <w:start w:val="1"/>
+      <w:numFmt w:val="bullet"/>
+      <w:lvlText w:val=""/>
+      <w:lvlJc w:val="left"/>
+      <w:pPr>
+        <w:ind w:left="5029" w:hanging="360"/>
+      </w:pPr>
+      <w:rPr>
+        <w:rFonts w:ascii="Wingdings" w:hAnsi="Wingdings" w:hint="default"/>
+      </w:rPr>
+    </w:lvl>
+    <w:lvl w:ilvl="6" w:tplc="280A0001" w:tentative="1">
+      <w:start w:val="1"/>
+      <w:numFmt w:val="bullet"/>
+      <w:lvlText w:val=""/>
+      <w:lvlJc w:val="left"/>
+      <w:pPr>
+        <w:ind w:left="5749" w:hanging="360"/>
+      </w:pPr>
+      <w:rPr>
+        <w:rFonts w:ascii="Symbol" w:hAnsi="Symbol" w:hint="default"/>
+      </w:rPr>
+    </w:lvl>
+    <w:lvl w:ilvl="7" w:tplc="280A0003" w:tentative="1">
+      <w:start w:val="1"/>
+      <w:numFmt w:val="bullet"/>
+      <w:lvlText w:val="o"/>
+      <w:lvlJc w:val="left"/>
+      <w:pPr>
+        <w:ind w:left="6469" w:hanging="360"/>
+      </w:pPr>
+      <w:rPr>
+        <w:rFonts w:ascii="Courier New" w:hAnsi="Courier New" w:cs="Courier New" w:hint="default"/>
+      </w:rPr>
+    </w:lvl>
+    <w:lvl w:ilvl="8" w:tplc="280A0005" w:tentative="1">
+      <w:start w:val="1"/>
+      <w:numFmt w:val="bullet"/>
+      <w:lvlText w:val=""/>
+      <w:lvlJc w:val="left"/>
+      <w:pPr>
+        <w:ind w:left="7189" w:hanging="360"/>
+      </w:pPr>
+      <w:rPr>
+        <w:rFonts w:ascii="Wingdings" w:hAnsi="Wingdings" w:hint="default"/>
+      </w:rPr>
+    </w:lvl>
+  </w:abstractNum>
+  <w:abstractNum w:abstractNumId="8" w15:restartNumberingAfterBreak="0">
     <w:nsid w:val="3F8875BF"/>
     <w:multiLevelType w:val="hybridMultilevel"/>
     <w:tmpl w:val="CD7EFD86"/>
@@ -4929,7 +5899,7 @@
       </w:rPr>
     </w:lvl>
   </w:abstractNum>
-  <w:abstractNum w:abstractNumId="8" w15:restartNumberingAfterBreak="0">
+  <w:abstractNum w:abstractNumId="9" w15:restartNumberingAfterBreak="0">
     <w:nsid w:val="3FAA1B4C"/>
     <w:multiLevelType w:val="hybridMultilevel"/>
     <w:tmpl w:val="C2CECCDA"/>
@@ -5042,7 +6012,120 @@
       </w:rPr>
     </w:lvl>
   </w:abstractNum>
-  <w:abstractNum w:abstractNumId="9" w15:restartNumberingAfterBreak="0">
+  <w:abstractNum w:abstractNumId="10" w15:restartNumberingAfterBreak="0">
+    <w:nsid w:val="5A39774B"/>
+    <w:multiLevelType w:val="hybridMultilevel"/>
+    <w:tmpl w:val="90905EFC"/>
+    <w:lvl w:ilvl="0" w:tplc="280A0001">
+      <w:start w:val="1"/>
+      <w:numFmt w:val="bullet"/>
+      <w:lvlText w:val=""/>
+      <w:lvlJc w:val="left"/>
+      <w:pPr>
+        <w:ind w:left="1429" w:hanging="360"/>
+      </w:pPr>
+      <w:rPr>
+        <w:rFonts w:ascii="Symbol" w:hAnsi="Symbol" w:hint="default"/>
+      </w:rPr>
+    </w:lvl>
+    <w:lvl w:ilvl="1" w:tplc="280A0003" w:tentative="1">
+      <w:start w:val="1"/>
+      <w:numFmt w:val="bullet"/>
+      <w:lvlText w:val="o"/>
+      <w:lvlJc w:val="left"/>
+      <w:pPr>
+        <w:ind w:left="2149" w:hanging="360"/>
+      </w:pPr>
+      <w:rPr>
+        <w:rFonts w:ascii="Courier New" w:hAnsi="Courier New" w:cs="Courier New" w:hint="default"/>
+      </w:rPr>
+    </w:lvl>
+    <w:lvl w:ilvl="2" w:tplc="280A0005" w:tentative="1">
+      <w:start w:val="1"/>
+      <w:numFmt w:val="bullet"/>
+      <w:lvlText w:val=""/>
+      <w:lvlJc w:val="left"/>
+      <w:pPr>
+        <w:ind w:left="2869" w:hanging="360"/>
+      </w:pPr>
+      <w:rPr>
+        <w:rFonts w:ascii="Wingdings" w:hAnsi="Wingdings" w:hint="default"/>
+      </w:rPr>
+    </w:lvl>
+    <w:lvl w:ilvl="3" w:tplc="280A0001" w:tentative="1">
+      <w:start w:val="1"/>
+      <w:numFmt w:val="bullet"/>
+      <w:lvlText w:val=""/>
+      <w:lvlJc w:val="left"/>
+      <w:pPr>
+        <w:ind w:left="3589" w:hanging="360"/>
+      </w:pPr>
+      <w:rPr>
+        <w:rFonts w:ascii="Symbol" w:hAnsi="Symbol" w:hint="default"/>
+      </w:rPr>
+    </w:lvl>
+    <w:lvl w:ilvl="4" w:tplc="280A0003" w:tentative="1">
+      <w:start w:val="1"/>
+      <w:numFmt w:val="bullet"/>
+      <w:lvlText w:val="o"/>
+      <w:lvlJc w:val="left"/>
+      <w:pPr>
+        <w:ind w:left="4309" w:hanging="360"/>
+      </w:pPr>
+      <w:rPr>
+        <w:rFonts w:ascii="Courier New" w:hAnsi="Courier New" w:cs="Courier New" w:hint="default"/>
+      </w:rPr>
+    </w:lvl>
+    <w:lvl w:ilvl="5" w:tplc="280A0005" w:tentative="1">
+      <w:start w:val="1"/>
+      <w:numFmt w:val="bullet"/>
+      <w:lvlText w:val=""/>
+      <w:lvlJc w:val="left"/>
+      <w:pPr>
+        <w:ind w:left="5029" w:hanging="360"/>
+      </w:pPr>
+      <w:rPr>
+        <w:rFonts w:ascii="Wingdings" w:hAnsi="Wingdings" w:hint="default"/>
+      </w:rPr>
+    </w:lvl>
+    <w:lvl w:ilvl="6" w:tplc="280A0001" w:tentative="1">
+      <w:start w:val="1"/>
+      <w:numFmt w:val="bullet"/>
+      <w:lvlText w:val=""/>
+      <w:lvlJc w:val="left"/>
+      <w:pPr>
+        <w:ind w:left="5749" w:hanging="360"/>
+      </w:pPr>
+      <w:rPr>
+        <w:rFonts w:ascii="Symbol" w:hAnsi="Symbol" w:hint="default"/>
+      </w:rPr>
+    </w:lvl>
+    <w:lvl w:ilvl="7" w:tplc="280A0003" w:tentative="1">
+      <w:start w:val="1"/>
+      <w:numFmt w:val="bullet"/>
+      <w:lvlText w:val="o"/>
+      <w:lvlJc w:val="left"/>
+      <w:pPr>
+        <w:ind w:left="6469" w:hanging="360"/>
+      </w:pPr>
+      <w:rPr>
+        <w:rFonts w:ascii="Courier New" w:hAnsi="Courier New" w:cs="Courier New" w:hint="default"/>
+      </w:rPr>
+    </w:lvl>
+    <w:lvl w:ilvl="8" w:tplc="280A0005" w:tentative="1">
+      <w:start w:val="1"/>
+      <w:numFmt w:val="bullet"/>
+      <w:lvlText w:val=""/>
+      <w:lvlJc w:val="left"/>
+      <w:pPr>
+        <w:ind w:left="7189" w:hanging="360"/>
+      </w:pPr>
+      <w:rPr>
+        <w:rFonts w:ascii="Wingdings" w:hAnsi="Wingdings" w:hint="default"/>
+      </w:rPr>
+    </w:lvl>
+  </w:abstractNum>
+  <w:abstractNum w:abstractNumId="11" w15:restartNumberingAfterBreak="0">
     <w:nsid w:val="60530F66"/>
     <w:multiLevelType w:val="hybridMultilevel"/>
     <w:tmpl w:val="4578819A"/>
@@ -5131,7 +6214,7 @@
       </w:pPr>
     </w:lvl>
   </w:abstractNum>
-  <w:abstractNum w:abstractNumId="10" w15:restartNumberingAfterBreak="0">
+  <w:abstractNum w:abstractNumId="12" w15:restartNumberingAfterBreak="0">
     <w:nsid w:val="6B833F8B"/>
     <w:multiLevelType w:val="hybridMultilevel"/>
     <w:tmpl w:val="D6704368"/>
@@ -5244,10 +6327,10 @@
       </w:rPr>
     </w:lvl>
   </w:abstractNum>
-  <w:abstractNum w:abstractNumId="11" w15:restartNumberingAfterBreak="0">
+  <w:abstractNum w:abstractNumId="13" w15:restartNumberingAfterBreak="0">
     <w:nsid w:val="78731422"/>
     <w:multiLevelType w:val="hybridMultilevel"/>
-    <w:tmpl w:val="61BCFDDA"/>
+    <w:tmpl w:val="7526A28C"/>
     <w:lvl w:ilvl="0" w:tplc="280A0001">
       <w:start w:val="1"/>
       <w:numFmt w:val="bullet"/>
@@ -5358,7 +6441,7 @@
     </w:lvl>
   </w:abstractNum>
   <w:num w:numId="1" w16cid:durableId="414592702">
-    <w:abstractNumId w:val="7"/>
+    <w:abstractNumId w:val="8"/>
   </w:num>
   <w:num w:numId="2" w16cid:durableId="1687519117">
     <w:abstractNumId w:val="3"/>
@@ -5367,7 +6450,7 @@
     <w:abstractNumId w:val="4"/>
   </w:num>
   <w:num w:numId="4" w16cid:durableId="1615559549">
-    <w:abstractNumId w:val="9"/>
+    <w:abstractNumId w:val="11"/>
   </w:num>
   <w:num w:numId="5" w16cid:durableId="1659769566">
     <w:abstractNumId w:val="0"/>
@@ -5379,10 +6462,10 @@
     <w:abstractNumId w:val="1"/>
   </w:num>
   <w:num w:numId="8" w16cid:durableId="373235599">
-    <w:abstractNumId w:val="10"/>
+    <w:abstractNumId w:val="12"/>
   </w:num>
   <w:num w:numId="9" w16cid:durableId="1512649048">
-    <w:abstractNumId w:val="8"/>
+    <w:abstractNumId w:val="9"/>
   </w:num>
   <w:num w:numId="10" w16cid:durableId="1194416391">
     <w:abstractNumId w:val="5"/>
@@ -5391,7 +6474,13 @@
     <w:abstractNumId w:val="6"/>
   </w:num>
   <w:num w:numId="12" w16cid:durableId="12074471">
-    <w:abstractNumId w:val="11"/>
+    <w:abstractNumId w:val="13"/>
+  </w:num>
+  <w:num w:numId="13" w16cid:durableId="384303334">
+    <w:abstractNumId w:val="7"/>
+  </w:num>
+  <w:num w:numId="14" w16cid:durableId="220021683">
+    <w:abstractNumId w:val="10"/>
   </w:num>
 </w:numbering>
 </file>
@@ -5794,7 +6883,7 @@
   <w:style w:type="paragraph" w:default="1" w:styleId="Normal">
     <w:name w:val="Normal"/>
     <w:qFormat/>
-    <w:rsid w:val="00A4511C"/>
+    <w:rsid w:val="00F47A78"/>
   </w:style>
   <w:style w:type="paragraph" w:styleId="Ttulo1">
     <w:name w:val="heading 1"/>

</xml_diff>

<commit_message>
Actualización del punto 3
</commit_message>
<xml_diff>
--- a/PROYECTO FINAL/INFORME FINAL.docx
+++ b/PROYECTO FINAL/INFORME FINAL.docx
@@ -1166,7 +1166,7 @@
         </w:rPr>
         <w:fldChar w:fldCharType="separate"/>
       </w:r>
-      <w:hyperlink w:anchor="_Toc232690649" w:history="1">
+      <w:hyperlink w:anchor="_Toc232757464" w:history="1">
         <w:r>
           <w:rPr>
             <w:rStyle w:val="Hipervnculo"/>
@@ -1193,7 +1193,7 @@
             <w:noProof/>
             <w:webHidden/>
           </w:rPr>
-          <w:instrText xml:space="preserve"> PAGEREF _Toc232690649 \h </w:instrText>
+          <w:instrText xml:space="preserve"> PAGEREF _Toc232757464 \h </w:instrText>
         </w:r>
         <w:r>
           <w:rPr>
@@ -1213,7 +1213,7 @@
             <w:noProof/>
             <w:webHidden/>
           </w:rPr>
-          <w:t>3</w:t>
+          <w:t>4</w:t>
         </w:r>
         <w:r>
           <w:rPr>
@@ -1240,7 +1240,7 @@
           <w14:ligatures w14:val="standardContextual"/>
         </w:rPr>
       </w:pPr>
-      <w:hyperlink w:anchor="_Toc232690650" w:history="1">
+      <w:hyperlink w:anchor="_Toc232757465" w:history="1">
         <w:r>
           <w:rPr>
             <w:rStyle w:val="Hipervnculo"/>
@@ -1285,7 +1285,7 @@
             <w:noProof/>
             <w:webHidden/>
           </w:rPr>
-          <w:instrText xml:space="preserve"> PAGEREF _Toc232690650 \h </w:instrText>
+          <w:instrText xml:space="preserve"> PAGEREF _Toc232757465 \h </w:instrText>
         </w:r>
         <w:r>
           <w:rPr>
@@ -1305,7 +1305,7 @@
             <w:noProof/>
             <w:webHidden/>
           </w:rPr>
-          <w:t>3</w:t>
+          <w:t>4</w:t>
         </w:r>
         <w:r>
           <w:rPr>
@@ -1332,7 +1332,7 @@
           <w14:ligatures w14:val="standardContextual"/>
         </w:rPr>
       </w:pPr>
-      <w:hyperlink w:anchor="_Toc232690651" w:history="1">
+      <w:hyperlink w:anchor="_Toc232757466" w:history="1">
         <w:r>
           <w:rPr>
             <w:rStyle w:val="Hipervnculo"/>
@@ -1377,7 +1377,7 @@
             <w:noProof/>
             <w:webHidden/>
           </w:rPr>
-          <w:instrText xml:space="preserve"> PAGEREF _Toc232690651 \h </w:instrText>
+          <w:instrText xml:space="preserve"> PAGEREF _Toc232757466 \h </w:instrText>
         </w:r>
         <w:r>
           <w:rPr>
@@ -1397,7 +1397,7 @@
             <w:noProof/>
             <w:webHidden/>
           </w:rPr>
-          <w:t>3</w:t>
+          <w:t>4</w:t>
         </w:r>
         <w:r>
           <w:rPr>
@@ -1424,7 +1424,7 @@
           <w14:ligatures w14:val="standardContextual"/>
         </w:rPr>
       </w:pPr>
-      <w:hyperlink w:anchor="_Toc232690652" w:history="1">
+      <w:hyperlink w:anchor="_Toc232757467" w:history="1">
         <w:r>
           <w:rPr>
             <w:rStyle w:val="Hipervnculo"/>
@@ -1469,7 +1469,7 @@
             <w:noProof/>
             <w:webHidden/>
           </w:rPr>
-          <w:instrText xml:space="preserve"> PAGEREF _Toc232690652 \h </w:instrText>
+          <w:instrText xml:space="preserve"> PAGEREF _Toc232757467 \h </w:instrText>
         </w:r>
         <w:r>
           <w:rPr>
@@ -1489,7 +1489,7 @@
             <w:noProof/>
             <w:webHidden/>
           </w:rPr>
-          <w:t>3</w:t>
+          <w:t>4</w:t>
         </w:r>
         <w:r>
           <w:rPr>
@@ -1516,7 +1516,7 @@
           <w14:ligatures w14:val="standardContextual"/>
         </w:rPr>
       </w:pPr>
-      <w:hyperlink w:anchor="_Toc232690653" w:history="1">
+      <w:hyperlink w:anchor="_Toc232757468" w:history="1">
         <w:r>
           <w:rPr>
             <w:rStyle w:val="Hipervnculo"/>
@@ -1561,7 +1561,7 @@
             <w:noProof/>
             <w:webHidden/>
           </w:rPr>
-          <w:instrText xml:space="preserve"> PAGEREF _Toc232690653 \h </w:instrText>
+          <w:instrText xml:space="preserve"> PAGEREF _Toc232757468 \h </w:instrText>
         </w:r>
         <w:r>
           <w:rPr>
@@ -1581,7 +1581,7 @@
             <w:noProof/>
             <w:webHidden/>
           </w:rPr>
-          <w:t>6</w:t>
+          <w:t>7</w:t>
         </w:r>
         <w:r>
           <w:rPr>
@@ -1608,7 +1608,7 @@
           <w14:ligatures w14:val="standardContextual"/>
         </w:rPr>
       </w:pPr>
-      <w:hyperlink w:anchor="_Toc232690654" w:history="1">
+      <w:hyperlink w:anchor="_Toc232757469" w:history="1">
         <w:r>
           <w:rPr>
             <w:rStyle w:val="Hipervnculo"/>
@@ -1653,7 +1653,7 @@
             <w:noProof/>
             <w:webHidden/>
           </w:rPr>
-          <w:instrText xml:space="preserve"> PAGEREF _Toc232690654 \h </w:instrText>
+          <w:instrText xml:space="preserve"> PAGEREF _Toc232757469 \h </w:instrText>
         </w:r>
         <w:r>
           <w:rPr>
@@ -1673,7 +1673,7 @@
             <w:noProof/>
             <w:webHidden/>
           </w:rPr>
-          <w:t>8</w:t>
+          <w:t>9</w:t>
         </w:r>
         <w:r>
           <w:rPr>
@@ -1700,7 +1700,7 @@
           <w14:ligatures w14:val="standardContextual"/>
         </w:rPr>
       </w:pPr>
-      <w:hyperlink w:anchor="_Toc232690655" w:history="1">
+      <w:hyperlink w:anchor="_Toc232757470" w:history="1">
         <w:r>
           <w:rPr>
             <w:rStyle w:val="Hipervnculo"/>
@@ -1745,7 +1745,7 @@
             <w:noProof/>
             <w:webHidden/>
           </w:rPr>
-          <w:instrText xml:space="preserve"> PAGEREF _Toc232690655 \h </w:instrText>
+          <w:instrText xml:space="preserve"> PAGEREF _Toc232757470 \h </w:instrText>
         </w:r>
         <w:r>
           <w:rPr>
@@ -1765,7 +1765,7 @@
             <w:noProof/>
             <w:webHidden/>
           </w:rPr>
-          <w:t>8</w:t>
+          <w:t>9</w:t>
         </w:r>
         <w:r>
           <w:rPr>
@@ -1792,7 +1792,7 @@
           <w14:ligatures w14:val="standardContextual"/>
         </w:rPr>
       </w:pPr>
-      <w:hyperlink w:anchor="_Toc232690656" w:history="1">
+      <w:hyperlink w:anchor="_Toc232757471" w:history="1">
         <w:r>
           <w:rPr>
             <w:rStyle w:val="Hipervnculo"/>
@@ -1837,7 +1837,7 @@
             <w:noProof/>
             <w:webHidden/>
           </w:rPr>
-          <w:instrText xml:space="preserve"> PAGEREF _Toc232690656 \h </w:instrText>
+          <w:instrText xml:space="preserve"> PAGEREF _Toc232757471 \h </w:instrText>
         </w:r>
         <w:r>
           <w:rPr>
@@ -1857,7 +1857,7 @@
             <w:noProof/>
             <w:webHidden/>
           </w:rPr>
-          <w:t>9</w:t>
+          <w:t>10</w:t>
         </w:r>
         <w:r>
           <w:rPr>
@@ -1884,7 +1884,7 @@
           <w14:ligatures w14:val="standardContextual"/>
         </w:rPr>
       </w:pPr>
-      <w:hyperlink w:anchor="_Toc232690657" w:history="1">
+      <w:hyperlink w:anchor="_Toc232757472" w:history="1">
         <w:r>
           <w:rPr>
             <w:rStyle w:val="Hipervnculo"/>
@@ -1929,7 +1929,7 @@
             <w:noProof/>
             <w:webHidden/>
           </w:rPr>
-          <w:instrText xml:space="preserve"> PAGEREF _Toc232690657 \h </w:instrText>
+          <w:instrText xml:space="preserve"> PAGEREF _Toc232757472 \h </w:instrText>
         </w:r>
         <w:r>
           <w:rPr>
@@ -1949,7 +1949,7 @@
             <w:noProof/>
             <w:webHidden/>
           </w:rPr>
-          <w:t>9</w:t>
+          <w:t>10</w:t>
         </w:r>
         <w:r>
           <w:rPr>
@@ -1976,7 +1976,7 @@
           <w14:ligatures w14:val="standardContextual"/>
         </w:rPr>
       </w:pPr>
-      <w:hyperlink w:anchor="_Toc232690658" w:history="1">
+      <w:hyperlink w:anchor="_Toc232757473" w:history="1">
         <w:r>
           <w:rPr>
             <w:rStyle w:val="Hipervnculo"/>
@@ -2021,7 +2021,7 @@
             <w:noProof/>
             <w:webHidden/>
           </w:rPr>
-          <w:instrText xml:space="preserve"> PAGEREF _Toc232690658 \h </w:instrText>
+          <w:instrText xml:space="preserve"> PAGEREF _Toc232757473 \h </w:instrText>
         </w:r>
         <w:r>
           <w:rPr>
@@ -2041,7 +2041,7 @@
             <w:noProof/>
             <w:webHidden/>
           </w:rPr>
-          <w:t>11</w:t>
+          <w:t>12</w:t>
         </w:r>
         <w:r>
           <w:rPr>
@@ -2067,7 +2067,7 @@
           <w14:ligatures w14:val="standardContextual"/>
         </w:rPr>
       </w:pPr>
-      <w:hyperlink w:anchor="_Toc232690659" w:history="1">
+      <w:hyperlink w:anchor="_Toc232757474" w:history="1">
         <w:r>
           <w:rPr>
             <w:rStyle w:val="Hipervnculo"/>
@@ -2094,7 +2094,7 @@
             <w:noProof/>
             <w:webHidden/>
           </w:rPr>
-          <w:instrText xml:space="preserve"> PAGEREF _Toc232690659 \h </w:instrText>
+          <w:instrText xml:space="preserve"> PAGEREF _Toc232757474 \h </w:instrText>
         </w:r>
         <w:r>
           <w:rPr>
@@ -2114,7 +2114,7 @@
             <w:noProof/>
             <w:webHidden/>
           </w:rPr>
-          <w:t>12</w:t>
+          <w:t>13</w:t>
         </w:r>
         <w:r>
           <w:rPr>
@@ -2141,7 +2141,7 @@
           <w14:ligatures w14:val="standardContextual"/>
         </w:rPr>
       </w:pPr>
-      <w:hyperlink w:anchor="_Toc232690660" w:history="1">
+      <w:hyperlink w:anchor="_Toc232757475" w:history="1">
         <w:r>
           <w:rPr>
             <w:rStyle w:val="Hipervnculo"/>
@@ -2186,7 +2186,7 @@
             <w:noProof/>
             <w:webHidden/>
           </w:rPr>
-          <w:instrText xml:space="preserve"> PAGEREF _Toc232690660 \h </w:instrText>
+          <w:instrText xml:space="preserve"> PAGEREF _Toc232757475 \h </w:instrText>
         </w:r>
         <w:r>
           <w:rPr>
@@ -2206,7 +2206,7 @@
             <w:noProof/>
             <w:webHidden/>
           </w:rPr>
-          <w:t>12</w:t>
+          <w:t>13</w:t>
         </w:r>
         <w:r>
           <w:rPr>
@@ -2219,9 +2219,9 @@
     </w:p>
     <w:p>
       <w:pPr>
-        <w:pStyle w:val="TDC2"/>
+        <w:pStyle w:val="TDC3"/>
         <w:tabs>
-          <w:tab w:val="left" w:pos="720"/>
+          <w:tab w:val="left" w:pos="1200"/>
           <w:tab w:val="right" w:leader="dot" w:pos="9016"/>
         </w:tabs>
         <w:rPr>
@@ -2233,13 +2233,13 @@
           <w14:ligatures w14:val="standardContextual"/>
         </w:rPr>
       </w:pPr>
-      <w:hyperlink w:anchor="_Toc232690661" w:history="1">
+      <w:hyperlink w:anchor="_Toc232757476" w:history="1">
         <w:r>
           <w:rPr>
             <w:rStyle w:val="Hipervnculo"/>
             <w:noProof/>
           </w:rPr>
-          <w:t>4.</w:t>
+          <w:t>3.1.</w:t>
         </w:r>
         <w:r>
           <w:rPr>
@@ -2257,7 +2257,7 @@
             <w:rStyle w:val="Hipervnculo"/>
             <w:noProof/>
           </w:rPr>
-          <w:t>Descripción de funcionalidades</w:t>
+          <w:t>Diagrama Detallado de la Arquitectura Cliente – Servidor</w:t>
         </w:r>
         <w:r>
           <w:rPr>
@@ -2278,7 +2278,7 @@
             <w:noProof/>
             <w:webHidden/>
           </w:rPr>
-          <w:instrText xml:space="preserve"> PAGEREF _Toc232690661 \h </w:instrText>
+          <w:instrText xml:space="preserve"> PAGEREF _Toc232757476 \h </w:instrText>
         </w:r>
         <w:r>
           <w:rPr>
@@ -2298,7 +2298,7 @@
             <w:noProof/>
             <w:webHidden/>
           </w:rPr>
-          <w:t>12</w:t>
+          <w:t>13</w:t>
         </w:r>
         <w:r>
           <w:rPr>
@@ -2311,9 +2311,9 @@
     </w:p>
     <w:p>
       <w:pPr>
-        <w:pStyle w:val="TDC2"/>
+        <w:pStyle w:val="TDC3"/>
         <w:tabs>
-          <w:tab w:val="left" w:pos="720"/>
+          <w:tab w:val="left" w:pos="1200"/>
           <w:tab w:val="right" w:leader="dot" w:pos="9016"/>
         </w:tabs>
         <w:rPr>
@@ -2325,13 +2325,13 @@
           <w14:ligatures w14:val="standardContextual"/>
         </w:rPr>
       </w:pPr>
-      <w:hyperlink w:anchor="_Toc232690662" w:history="1">
+      <w:hyperlink w:anchor="_Toc232757477" w:history="1">
         <w:r>
           <w:rPr>
             <w:rStyle w:val="Hipervnculo"/>
             <w:noProof/>
           </w:rPr>
-          <w:t>5.</w:t>
+          <w:t>3.2.</w:t>
         </w:r>
         <w:r>
           <w:rPr>
@@ -2349,7 +2349,7 @@
             <w:rStyle w:val="Hipervnculo"/>
             <w:noProof/>
           </w:rPr>
-          <w:t>Buenas prácticas aplicadas</w:t>
+          <w:t>Justificación del Stack Tecnológico (Mobile – First y Rendimiento)</w:t>
         </w:r>
         <w:r>
           <w:rPr>
@@ -2370,7 +2370,7 @@
             <w:noProof/>
             <w:webHidden/>
           </w:rPr>
-          <w:instrText xml:space="preserve"> PAGEREF _Toc232690662 \h </w:instrText>
+          <w:instrText xml:space="preserve"> PAGEREF _Toc232757477 \h </w:instrText>
         </w:r>
         <w:r>
           <w:rPr>
@@ -2390,7 +2390,7 @@
             <w:noProof/>
             <w:webHidden/>
           </w:rPr>
-          <w:t>12</w:t>
+          <w:t>13</w:t>
         </w:r>
         <w:r>
           <w:rPr>
@@ -2403,8 +2403,9 @@
     </w:p>
     <w:p>
       <w:pPr>
-        <w:pStyle w:val="TDC1"/>
+        <w:pStyle w:val="TDC3"/>
         <w:tabs>
+          <w:tab w:val="left" w:pos="1200"/>
           <w:tab w:val="right" w:leader="dot" w:pos="9016"/>
         </w:tabs>
         <w:rPr>
@@ -2416,23 +2417,41 @@
           <w14:ligatures w14:val="standardContextual"/>
         </w:rPr>
       </w:pPr>
-      <w:hyperlink w:anchor="_Toc232690663" w:history="1">
+      <w:hyperlink w:anchor="_Toc232757478" w:history="1">
         <w:r>
           <w:rPr>
             <w:rStyle w:val="Hipervnculo"/>
             <w:noProof/>
           </w:rPr>
-          <w:t>CAPÍTULO III</w:t>
-        </w:r>
-        <w:r>
-          <w:rPr>
-            <w:noProof/>
-            <w:webHidden/>
+          <w:t>3.3.</w:t>
+        </w:r>
+        <w:r>
+          <w:rPr>
+            <w:rFonts w:asciiTheme="minorHAnsi" w:eastAsiaTheme="minorEastAsia" w:hAnsiTheme="minorHAnsi"/>
+            <w:noProof/>
+            <w:kern w:val="2"/>
+            <w:szCs w:val="24"/>
+            <w:lang w:eastAsia="es-PE"/>
+            <w14:ligatures w14:val="standardContextual"/>
           </w:rPr>
           <w:tab/>
         </w:r>
         <w:r>
           <w:rPr>
+            <w:rStyle w:val="Hipervnculo"/>
+            <w:noProof/>
+          </w:rPr>
+          <w:t>Flujo de Navegación Coherente (User Flow)</w:t>
+        </w:r>
+        <w:r>
+          <w:rPr>
+            <w:noProof/>
+            <w:webHidden/>
+          </w:rPr>
+          <w:tab/>
+        </w:r>
+        <w:r>
+          <w:rPr>
             <w:noProof/>
             <w:webHidden/>
           </w:rPr>
@@ -2443,7 +2462,7 @@
             <w:noProof/>
             <w:webHidden/>
           </w:rPr>
-          <w:instrText xml:space="preserve"> PAGEREF _Toc232690663 \h </w:instrText>
+          <w:instrText xml:space="preserve"> PAGEREF _Toc232757478 \h </w:instrText>
         </w:r>
         <w:r>
           <w:rPr>
@@ -2463,7 +2482,7 @@
             <w:noProof/>
             <w:webHidden/>
           </w:rPr>
-          <w:t>13</w:t>
+          <w:t>14</w:t>
         </w:r>
         <w:r>
           <w:rPr>
@@ -2476,9 +2495,9 @@
     </w:p>
     <w:p>
       <w:pPr>
-        <w:pStyle w:val="TDC2"/>
+        <w:pStyle w:val="TDC3"/>
         <w:tabs>
-          <w:tab w:val="left" w:pos="720"/>
+          <w:tab w:val="left" w:pos="1200"/>
           <w:tab w:val="right" w:leader="dot" w:pos="9016"/>
         </w:tabs>
         <w:rPr>
@@ -2490,13 +2509,13 @@
           <w14:ligatures w14:val="standardContextual"/>
         </w:rPr>
       </w:pPr>
-      <w:hyperlink w:anchor="_Toc232690664" w:history="1">
+      <w:hyperlink w:anchor="_Toc232757479" w:history="1">
         <w:r>
           <w:rPr>
             <w:rStyle w:val="Hipervnculo"/>
             <w:noProof/>
           </w:rPr>
-          <w:t>6.</w:t>
+          <w:t>3.4.</w:t>
         </w:r>
         <w:r>
           <w:rPr>
@@ -2514,6 +2533,1005 @@
             <w:rStyle w:val="Hipervnculo"/>
             <w:noProof/>
           </w:rPr>
+          <w:t>Especificaciones de Diseño y Accesibilidad en Wireframes</w:t>
+        </w:r>
+        <w:r>
+          <w:rPr>
+            <w:noProof/>
+            <w:webHidden/>
+          </w:rPr>
+          <w:tab/>
+        </w:r>
+        <w:r>
+          <w:rPr>
+            <w:noProof/>
+            <w:webHidden/>
+          </w:rPr>
+          <w:fldChar w:fldCharType="begin"/>
+        </w:r>
+        <w:r>
+          <w:rPr>
+            <w:noProof/>
+            <w:webHidden/>
+          </w:rPr>
+          <w:instrText xml:space="preserve"> PAGEREF _Toc232757479 \h </w:instrText>
+        </w:r>
+        <w:r>
+          <w:rPr>
+            <w:noProof/>
+            <w:webHidden/>
+          </w:rPr>
+        </w:r>
+        <w:r>
+          <w:rPr>
+            <w:noProof/>
+            <w:webHidden/>
+          </w:rPr>
+          <w:fldChar w:fldCharType="separate"/>
+        </w:r>
+        <w:r>
+          <w:rPr>
+            <w:noProof/>
+            <w:webHidden/>
+          </w:rPr>
+          <w:t>14</w:t>
+        </w:r>
+        <w:r>
+          <w:rPr>
+            <w:noProof/>
+            <w:webHidden/>
+          </w:rPr>
+          <w:fldChar w:fldCharType="end"/>
+        </w:r>
+      </w:hyperlink>
+    </w:p>
+    <w:p>
+      <w:pPr>
+        <w:pStyle w:val="TDC2"/>
+        <w:tabs>
+          <w:tab w:val="left" w:pos="720"/>
+          <w:tab w:val="right" w:leader="dot" w:pos="9016"/>
+        </w:tabs>
+        <w:rPr>
+          <w:rFonts w:asciiTheme="minorHAnsi" w:eastAsiaTheme="minorEastAsia" w:hAnsiTheme="minorHAnsi"/>
+          <w:noProof/>
+          <w:kern w:val="2"/>
+          <w:szCs w:val="24"/>
+          <w:lang w:eastAsia="es-PE"/>
+          <w14:ligatures w14:val="standardContextual"/>
+        </w:rPr>
+      </w:pPr>
+      <w:hyperlink w:anchor="_Toc232757480" w:history="1">
+        <w:r>
+          <w:rPr>
+            <w:rStyle w:val="Hipervnculo"/>
+            <w:noProof/>
+          </w:rPr>
+          <w:t>4.</w:t>
+        </w:r>
+        <w:r>
+          <w:rPr>
+            <w:rFonts w:asciiTheme="minorHAnsi" w:eastAsiaTheme="minorEastAsia" w:hAnsiTheme="minorHAnsi"/>
+            <w:noProof/>
+            <w:kern w:val="2"/>
+            <w:szCs w:val="24"/>
+            <w:lang w:eastAsia="es-PE"/>
+            <w14:ligatures w14:val="standardContextual"/>
+          </w:rPr>
+          <w:tab/>
+        </w:r>
+        <w:r>
+          <w:rPr>
+            <w:rStyle w:val="Hipervnculo"/>
+            <w:noProof/>
+          </w:rPr>
+          <w:t>Descripción de funcionalidades</w:t>
+        </w:r>
+        <w:r>
+          <w:rPr>
+            <w:noProof/>
+            <w:webHidden/>
+          </w:rPr>
+          <w:tab/>
+        </w:r>
+        <w:r>
+          <w:rPr>
+            <w:noProof/>
+            <w:webHidden/>
+          </w:rPr>
+          <w:fldChar w:fldCharType="begin"/>
+        </w:r>
+        <w:r>
+          <w:rPr>
+            <w:noProof/>
+            <w:webHidden/>
+          </w:rPr>
+          <w:instrText xml:space="preserve"> PAGEREF _Toc232757480 \h </w:instrText>
+        </w:r>
+        <w:r>
+          <w:rPr>
+            <w:noProof/>
+            <w:webHidden/>
+          </w:rPr>
+        </w:r>
+        <w:r>
+          <w:rPr>
+            <w:noProof/>
+            <w:webHidden/>
+          </w:rPr>
+          <w:fldChar w:fldCharType="separate"/>
+        </w:r>
+        <w:r>
+          <w:rPr>
+            <w:noProof/>
+            <w:webHidden/>
+          </w:rPr>
+          <w:t>14</w:t>
+        </w:r>
+        <w:r>
+          <w:rPr>
+            <w:noProof/>
+            <w:webHidden/>
+          </w:rPr>
+          <w:fldChar w:fldCharType="end"/>
+        </w:r>
+      </w:hyperlink>
+    </w:p>
+    <w:p>
+      <w:pPr>
+        <w:pStyle w:val="TDC3"/>
+        <w:tabs>
+          <w:tab w:val="left" w:pos="1200"/>
+          <w:tab w:val="right" w:leader="dot" w:pos="9016"/>
+        </w:tabs>
+        <w:rPr>
+          <w:rFonts w:asciiTheme="minorHAnsi" w:eastAsiaTheme="minorEastAsia" w:hAnsiTheme="minorHAnsi"/>
+          <w:noProof/>
+          <w:kern w:val="2"/>
+          <w:szCs w:val="24"/>
+          <w:lang w:eastAsia="es-PE"/>
+          <w14:ligatures w14:val="standardContextual"/>
+        </w:rPr>
+      </w:pPr>
+      <w:hyperlink w:anchor="_Toc232757481" w:history="1">
+        <w:r>
+          <w:rPr>
+            <w:rStyle w:val="Hipervnculo"/>
+            <w:noProof/>
+            <w:lang w:val="en-US"/>
+          </w:rPr>
+          <w:t>4.1.</w:t>
+        </w:r>
+        <w:r>
+          <w:rPr>
+            <w:rFonts w:asciiTheme="minorHAnsi" w:eastAsiaTheme="minorEastAsia" w:hAnsiTheme="minorHAnsi"/>
+            <w:noProof/>
+            <w:kern w:val="2"/>
+            <w:szCs w:val="24"/>
+            <w:lang w:eastAsia="es-PE"/>
+            <w14:ligatures w14:val="standardContextual"/>
+          </w:rPr>
+          <w:tab/>
+        </w:r>
+        <w:r>
+          <w:rPr>
+            <w:rStyle w:val="Hipervnculo"/>
+            <w:noProof/>
+            <w:lang w:val="en-US"/>
+          </w:rPr>
+          <w:t>Front – End (HTML, CSS, JS)</w:t>
+        </w:r>
+        <w:r>
+          <w:rPr>
+            <w:noProof/>
+            <w:webHidden/>
+          </w:rPr>
+          <w:tab/>
+        </w:r>
+        <w:r>
+          <w:rPr>
+            <w:noProof/>
+            <w:webHidden/>
+          </w:rPr>
+          <w:fldChar w:fldCharType="begin"/>
+        </w:r>
+        <w:r>
+          <w:rPr>
+            <w:noProof/>
+            <w:webHidden/>
+          </w:rPr>
+          <w:instrText xml:space="preserve"> PAGEREF _Toc232757481 \h </w:instrText>
+        </w:r>
+        <w:r>
+          <w:rPr>
+            <w:noProof/>
+            <w:webHidden/>
+          </w:rPr>
+        </w:r>
+        <w:r>
+          <w:rPr>
+            <w:noProof/>
+            <w:webHidden/>
+          </w:rPr>
+          <w:fldChar w:fldCharType="separate"/>
+        </w:r>
+        <w:r>
+          <w:rPr>
+            <w:noProof/>
+            <w:webHidden/>
+          </w:rPr>
+          <w:t>14</w:t>
+        </w:r>
+        <w:r>
+          <w:rPr>
+            <w:noProof/>
+            <w:webHidden/>
+          </w:rPr>
+          <w:fldChar w:fldCharType="end"/>
+        </w:r>
+      </w:hyperlink>
+    </w:p>
+    <w:p>
+      <w:pPr>
+        <w:pStyle w:val="TDC3"/>
+        <w:tabs>
+          <w:tab w:val="left" w:pos="1200"/>
+          <w:tab w:val="right" w:leader="dot" w:pos="9016"/>
+        </w:tabs>
+        <w:rPr>
+          <w:rFonts w:asciiTheme="minorHAnsi" w:eastAsiaTheme="minorEastAsia" w:hAnsiTheme="minorHAnsi"/>
+          <w:noProof/>
+          <w:kern w:val="2"/>
+          <w:szCs w:val="24"/>
+          <w:lang w:eastAsia="es-PE"/>
+          <w14:ligatures w14:val="standardContextual"/>
+        </w:rPr>
+      </w:pPr>
+      <w:hyperlink w:anchor="_Toc232757482" w:history="1">
+        <w:r>
+          <w:rPr>
+            <w:rStyle w:val="Hipervnculo"/>
+            <w:noProof/>
+            <w:lang w:val="en-US"/>
+          </w:rPr>
+          <w:t>4.2.</w:t>
+        </w:r>
+        <w:r>
+          <w:rPr>
+            <w:rFonts w:asciiTheme="minorHAnsi" w:eastAsiaTheme="minorEastAsia" w:hAnsiTheme="minorHAnsi"/>
+            <w:noProof/>
+            <w:kern w:val="2"/>
+            <w:szCs w:val="24"/>
+            <w:lang w:eastAsia="es-PE"/>
+            <w14:ligatures w14:val="standardContextual"/>
+          </w:rPr>
+          <w:tab/>
+        </w:r>
+        <w:r>
+          <w:rPr>
+            <w:rStyle w:val="Hipervnculo"/>
+            <w:noProof/>
+            <w:lang w:val="en-US"/>
+          </w:rPr>
+          <w:t>Back – End (Node.js, Express)</w:t>
+        </w:r>
+        <w:r>
+          <w:rPr>
+            <w:noProof/>
+            <w:webHidden/>
+          </w:rPr>
+          <w:tab/>
+        </w:r>
+        <w:r>
+          <w:rPr>
+            <w:noProof/>
+            <w:webHidden/>
+          </w:rPr>
+          <w:fldChar w:fldCharType="begin"/>
+        </w:r>
+        <w:r>
+          <w:rPr>
+            <w:noProof/>
+            <w:webHidden/>
+          </w:rPr>
+          <w:instrText xml:space="preserve"> PAGEREF _Toc232757482 \h </w:instrText>
+        </w:r>
+        <w:r>
+          <w:rPr>
+            <w:noProof/>
+            <w:webHidden/>
+          </w:rPr>
+        </w:r>
+        <w:r>
+          <w:rPr>
+            <w:noProof/>
+            <w:webHidden/>
+          </w:rPr>
+          <w:fldChar w:fldCharType="separate"/>
+        </w:r>
+        <w:r>
+          <w:rPr>
+            <w:noProof/>
+            <w:webHidden/>
+          </w:rPr>
+          <w:t>14</w:t>
+        </w:r>
+        <w:r>
+          <w:rPr>
+            <w:noProof/>
+            <w:webHidden/>
+          </w:rPr>
+          <w:fldChar w:fldCharType="end"/>
+        </w:r>
+      </w:hyperlink>
+    </w:p>
+    <w:p>
+      <w:pPr>
+        <w:pStyle w:val="TDC3"/>
+        <w:tabs>
+          <w:tab w:val="left" w:pos="1200"/>
+          <w:tab w:val="right" w:leader="dot" w:pos="9016"/>
+        </w:tabs>
+        <w:rPr>
+          <w:rFonts w:asciiTheme="minorHAnsi" w:eastAsiaTheme="minorEastAsia" w:hAnsiTheme="minorHAnsi"/>
+          <w:noProof/>
+          <w:kern w:val="2"/>
+          <w:szCs w:val="24"/>
+          <w:lang w:eastAsia="es-PE"/>
+          <w14:ligatures w14:val="standardContextual"/>
+        </w:rPr>
+      </w:pPr>
+      <w:hyperlink w:anchor="_Toc232757483" w:history="1">
+        <w:r>
+          <w:rPr>
+            <w:rStyle w:val="Hipervnculo"/>
+            <w:noProof/>
+            <w:lang w:val="en-US"/>
+          </w:rPr>
+          <w:t>4.3.</w:t>
+        </w:r>
+        <w:r>
+          <w:rPr>
+            <w:rFonts w:asciiTheme="minorHAnsi" w:eastAsiaTheme="minorEastAsia" w:hAnsiTheme="minorHAnsi"/>
+            <w:noProof/>
+            <w:kern w:val="2"/>
+            <w:szCs w:val="24"/>
+            <w:lang w:eastAsia="es-PE"/>
+            <w14:ligatures w14:val="standardContextual"/>
+          </w:rPr>
+          <w:tab/>
+        </w:r>
+        <w:r>
+          <w:rPr>
+            <w:rStyle w:val="Hipervnculo"/>
+            <w:noProof/>
+            <w:lang w:val="en-US"/>
+          </w:rPr>
+          <w:t>Características implementadas</w:t>
+        </w:r>
+        <w:r>
+          <w:rPr>
+            <w:noProof/>
+            <w:webHidden/>
+          </w:rPr>
+          <w:tab/>
+        </w:r>
+        <w:r>
+          <w:rPr>
+            <w:noProof/>
+            <w:webHidden/>
+          </w:rPr>
+          <w:fldChar w:fldCharType="begin"/>
+        </w:r>
+        <w:r>
+          <w:rPr>
+            <w:noProof/>
+            <w:webHidden/>
+          </w:rPr>
+          <w:instrText xml:space="preserve"> PAGEREF _Toc232757483 \h </w:instrText>
+        </w:r>
+        <w:r>
+          <w:rPr>
+            <w:noProof/>
+            <w:webHidden/>
+          </w:rPr>
+        </w:r>
+        <w:r>
+          <w:rPr>
+            <w:noProof/>
+            <w:webHidden/>
+          </w:rPr>
+          <w:fldChar w:fldCharType="separate"/>
+        </w:r>
+        <w:r>
+          <w:rPr>
+            <w:noProof/>
+            <w:webHidden/>
+          </w:rPr>
+          <w:t>14</w:t>
+        </w:r>
+        <w:r>
+          <w:rPr>
+            <w:noProof/>
+            <w:webHidden/>
+          </w:rPr>
+          <w:fldChar w:fldCharType="end"/>
+        </w:r>
+      </w:hyperlink>
+    </w:p>
+    <w:p>
+      <w:pPr>
+        <w:pStyle w:val="TDC2"/>
+        <w:tabs>
+          <w:tab w:val="left" w:pos="720"/>
+          <w:tab w:val="right" w:leader="dot" w:pos="9016"/>
+        </w:tabs>
+        <w:rPr>
+          <w:rFonts w:asciiTheme="minorHAnsi" w:eastAsiaTheme="minorEastAsia" w:hAnsiTheme="minorHAnsi"/>
+          <w:noProof/>
+          <w:kern w:val="2"/>
+          <w:szCs w:val="24"/>
+          <w:lang w:eastAsia="es-PE"/>
+          <w14:ligatures w14:val="standardContextual"/>
+        </w:rPr>
+      </w:pPr>
+      <w:hyperlink w:anchor="_Toc232757484" w:history="1">
+        <w:r>
+          <w:rPr>
+            <w:rStyle w:val="Hipervnculo"/>
+            <w:noProof/>
+          </w:rPr>
+          <w:t>5.</w:t>
+        </w:r>
+        <w:r>
+          <w:rPr>
+            <w:rFonts w:asciiTheme="minorHAnsi" w:eastAsiaTheme="minorEastAsia" w:hAnsiTheme="minorHAnsi"/>
+            <w:noProof/>
+            <w:kern w:val="2"/>
+            <w:szCs w:val="24"/>
+            <w:lang w:eastAsia="es-PE"/>
+            <w14:ligatures w14:val="standardContextual"/>
+          </w:rPr>
+          <w:tab/>
+        </w:r>
+        <w:r>
+          <w:rPr>
+            <w:rStyle w:val="Hipervnculo"/>
+            <w:noProof/>
+          </w:rPr>
+          <w:t>Buenas prácticas aplicadas</w:t>
+        </w:r>
+        <w:r>
+          <w:rPr>
+            <w:noProof/>
+            <w:webHidden/>
+          </w:rPr>
+          <w:tab/>
+        </w:r>
+        <w:r>
+          <w:rPr>
+            <w:noProof/>
+            <w:webHidden/>
+          </w:rPr>
+          <w:fldChar w:fldCharType="begin"/>
+        </w:r>
+        <w:r>
+          <w:rPr>
+            <w:noProof/>
+            <w:webHidden/>
+          </w:rPr>
+          <w:instrText xml:space="preserve"> PAGEREF _Toc232757484 \h </w:instrText>
+        </w:r>
+        <w:r>
+          <w:rPr>
+            <w:noProof/>
+            <w:webHidden/>
+          </w:rPr>
+        </w:r>
+        <w:r>
+          <w:rPr>
+            <w:noProof/>
+            <w:webHidden/>
+          </w:rPr>
+          <w:fldChar w:fldCharType="separate"/>
+        </w:r>
+        <w:r>
+          <w:rPr>
+            <w:noProof/>
+            <w:webHidden/>
+          </w:rPr>
+          <w:t>14</w:t>
+        </w:r>
+        <w:r>
+          <w:rPr>
+            <w:noProof/>
+            <w:webHidden/>
+          </w:rPr>
+          <w:fldChar w:fldCharType="end"/>
+        </w:r>
+      </w:hyperlink>
+    </w:p>
+    <w:p>
+      <w:pPr>
+        <w:pStyle w:val="TDC3"/>
+        <w:tabs>
+          <w:tab w:val="left" w:pos="1200"/>
+          <w:tab w:val="right" w:leader="dot" w:pos="9016"/>
+        </w:tabs>
+        <w:rPr>
+          <w:rFonts w:asciiTheme="minorHAnsi" w:eastAsiaTheme="minorEastAsia" w:hAnsiTheme="minorHAnsi"/>
+          <w:noProof/>
+          <w:kern w:val="2"/>
+          <w:szCs w:val="24"/>
+          <w:lang w:eastAsia="es-PE"/>
+          <w14:ligatures w14:val="standardContextual"/>
+        </w:rPr>
+      </w:pPr>
+      <w:hyperlink w:anchor="_Toc232757485" w:history="1">
+        <w:r>
+          <w:rPr>
+            <w:rStyle w:val="Hipervnculo"/>
+            <w:noProof/>
+          </w:rPr>
+          <w:t>5.1.</w:t>
+        </w:r>
+        <w:r>
+          <w:rPr>
+            <w:rFonts w:asciiTheme="minorHAnsi" w:eastAsiaTheme="minorEastAsia" w:hAnsiTheme="minorHAnsi"/>
+            <w:noProof/>
+            <w:kern w:val="2"/>
+            <w:szCs w:val="24"/>
+            <w:lang w:eastAsia="es-PE"/>
+            <w14:ligatures w14:val="standardContextual"/>
+          </w:rPr>
+          <w:tab/>
+        </w:r>
+        <w:r>
+          <w:rPr>
+            <w:rStyle w:val="Hipervnculo"/>
+            <w:noProof/>
+          </w:rPr>
+          <w:t>Accesibilidad</w:t>
+        </w:r>
+        <w:r>
+          <w:rPr>
+            <w:noProof/>
+            <w:webHidden/>
+          </w:rPr>
+          <w:tab/>
+        </w:r>
+        <w:r>
+          <w:rPr>
+            <w:noProof/>
+            <w:webHidden/>
+          </w:rPr>
+          <w:fldChar w:fldCharType="begin"/>
+        </w:r>
+        <w:r>
+          <w:rPr>
+            <w:noProof/>
+            <w:webHidden/>
+          </w:rPr>
+          <w:instrText xml:space="preserve"> PAGEREF _Toc232757485 \h </w:instrText>
+        </w:r>
+        <w:r>
+          <w:rPr>
+            <w:noProof/>
+            <w:webHidden/>
+          </w:rPr>
+        </w:r>
+        <w:r>
+          <w:rPr>
+            <w:noProof/>
+            <w:webHidden/>
+          </w:rPr>
+          <w:fldChar w:fldCharType="separate"/>
+        </w:r>
+        <w:r>
+          <w:rPr>
+            <w:noProof/>
+            <w:webHidden/>
+          </w:rPr>
+          <w:t>14</w:t>
+        </w:r>
+        <w:r>
+          <w:rPr>
+            <w:noProof/>
+            <w:webHidden/>
+          </w:rPr>
+          <w:fldChar w:fldCharType="end"/>
+        </w:r>
+      </w:hyperlink>
+    </w:p>
+    <w:p>
+      <w:pPr>
+        <w:pStyle w:val="TDC3"/>
+        <w:tabs>
+          <w:tab w:val="left" w:pos="1200"/>
+          <w:tab w:val="right" w:leader="dot" w:pos="9016"/>
+        </w:tabs>
+        <w:rPr>
+          <w:rFonts w:asciiTheme="minorHAnsi" w:eastAsiaTheme="minorEastAsia" w:hAnsiTheme="minorHAnsi"/>
+          <w:noProof/>
+          <w:kern w:val="2"/>
+          <w:szCs w:val="24"/>
+          <w:lang w:eastAsia="es-PE"/>
+          <w14:ligatures w14:val="standardContextual"/>
+        </w:rPr>
+      </w:pPr>
+      <w:hyperlink w:anchor="_Toc232757486" w:history="1">
+        <w:r>
+          <w:rPr>
+            <w:rStyle w:val="Hipervnculo"/>
+            <w:noProof/>
+          </w:rPr>
+          <w:t>5.2.</w:t>
+        </w:r>
+        <w:r>
+          <w:rPr>
+            <w:rFonts w:asciiTheme="minorHAnsi" w:eastAsiaTheme="minorEastAsia" w:hAnsiTheme="minorHAnsi"/>
+            <w:noProof/>
+            <w:kern w:val="2"/>
+            <w:szCs w:val="24"/>
+            <w:lang w:eastAsia="es-PE"/>
+            <w14:ligatures w14:val="standardContextual"/>
+          </w:rPr>
+          <w:tab/>
+        </w:r>
+        <w:r>
+          <w:rPr>
+            <w:rStyle w:val="Hipervnculo"/>
+            <w:noProof/>
+          </w:rPr>
+          <w:t>Privacidad</w:t>
+        </w:r>
+        <w:r>
+          <w:rPr>
+            <w:noProof/>
+            <w:webHidden/>
+          </w:rPr>
+          <w:tab/>
+        </w:r>
+        <w:r>
+          <w:rPr>
+            <w:noProof/>
+            <w:webHidden/>
+          </w:rPr>
+          <w:fldChar w:fldCharType="begin"/>
+        </w:r>
+        <w:r>
+          <w:rPr>
+            <w:noProof/>
+            <w:webHidden/>
+          </w:rPr>
+          <w:instrText xml:space="preserve"> PAGEREF _Toc232757486 \h </w:instrText>
+        </w:r>
+        <w:r>
+          <w:rPr>
+            <w:noProof/>
+            <w:webHidden/>
+          </w:rPr>
+        </w:r>
+        <w:r>
+          <w:rPr>
+            <w:noProof/>
+            <w:webHidden/>
+          </w:rPr>
+          <w:fldChar w:fldCharType="separate"/>
+        </w:r>
+        <w:r>
+          <w:rPr>
+            <w:noProof/>
+            <w:webHidden/>
+          </w:rPr>
+          <w:t>14</w:t>
+        </w:r>
+        <w:r>
+          <w:rPr>
+            <w:noProof/>
+            <w:webHidden/>
+          </w:rPr>
+          <w:fldChar w:fldCharType="end"/>
+        </w:r>
+      </w:hyperlink>
+    </w:p>
+    <w:p>
+      <w:pPr>
+        <w:pStyle w:val="TDC3"/>
+        <w:tabs>
+          <w:tab w:val="left" w:pos="1200"/>
+          <w:tab w:val="right" w:leader="dot" w:pos="9016"/>
+        </w:tabs>
+        <w:rPr>
+          <w:rFonts w:asciiTheme="minorHAnsi" w:eastAsiaTheme="minorEastAsia" w:hAnsiTheme="minorHAnsi"/>
+          <w:noProof/>
+          <w:kern w:val="2"/>
+          <w:szCs w:val="24"/>
+          <w:lang w:eastAsia="es-PE"/>
+          <w14:ligatures w14:val="standardContextual"/>
+        </w:rPr>
+      </w:pPr>
+      <w:hyperlink w:anchor="_Toc232757487" w:history="1">
+        <w:r>
+          <w:rPr>
+            <w:rStyle w:val="Hipervnculo"/>
+            <w:noProof/>
+          </w:rPr>
+          <w:t>5.3.</w:t>
+        </w:r>
+        <w:r>
+          <w:rPr>
+            <w:rFonts w:asciiTheme="minorHAnsi" w:eastAsiaTheme="minorEastAsia" w:hAnsiTheme="minorHAnsi"/>
+            <w:noProof/>
+            <w:kern w:val="2"/>
+            <w:szCs w:val="24"/>
+            <w:lang w:eastAsia="es-PE"/>
+            <w14:ligatures w14:val="standardContextual"/>
+          </w:rPr>
+          <w:tab/>
+        </w:r>
+        <w:r>
+          <w:rPr>
+            <w:rStyle w:val="Hipervnculo"/>
+            <w:noProof/>
+          </w:rPr>
+          <w:t>Diseño Responsivo</w:t>
+        </w:r>
+        <w:r>
+          <w:rPr>
+            <w:noProof/>
+            <w:webHidden/>
+          </w:rPr>
+          <w:tab/>
+        </w:r>
+        <w:r>
+          <w:rPr>
+            <w:noProof/>
+            <w:webHidden/>
+          </w:rPr>
+          <w:fldChar w:fldCharType="begin"/>
+        </w:r>
+        <w:r>
+          <w:rPr>
+            <w:noProof/>
+            <w:webHidden/>
+          </w:rPr>
+          <w:instrText xml:space="preserve"> PAGEREF _Toc232757487 \h </w:instrText>
+        </w:r>
+        <w:r>
+          <w:rPr>
+            <w:noProof/>
+            <w:webHidden/>
+          </w:rPr>
+        </w:r>
+        <w:r>
+          <w:rPr>
+            <w:noProof/>
+            <w:webHidden/>
+          </w:rPr>
+          <w:fldChar w:fldCharType="separate"/>
+        </w:r>
+        <w:r>
+          <w:rPr>
+            <w:noProof/>
+            <w:webHidden/>
+          </w:rPr>
+          <w:t>15</w:t>
+        </w:r>
+        <w:r>
+          <w:rPr>
+            <w:noProof/>
+            <w:webHidden/>
+          </w:rPr>
+          <w:fldChar w:fldCharType="end"/>
+        </w:r>
+      </w:hyperlink>
+    </w:p>
+    <w:p>
+      <w:pPr>
+        <w:pStyle w:val="TDC3"/>
+        <w:tabs>
+          <w:tab w:val="left" w:pos="1200"/>
+          <w:tab w:val="right" w:leader="dot" w:pos="9016"/>
+        </w:tabs>
+        <w:rPr>
+          <w:rFonts w:asciiTheme="minorHAnsi" w:eastAsiaTheme="minorEastAsia" w:hAnsiTheme="minorHAnsi"/>
+          <w:noProof/>
+          <w:kern w:val="2"/>
+          <w:szCs w:val="24"/>
+          <w:lang w:eastAsia="es-PE"/>
+          <w14:ligatures w14:val="standardContextual"/>
+        </w:rPr>
+      </w:pPr>
+      <w:hyperlink w:anchor="_Toc232757488" w:history="1">
+        <w:r>
+          <w:rPr>
+            <w:rStyle w:val="Hipervnculo"/>
+            <w:noProof/>
+          </w:rPr>
+          <w:t>5.4.</w:t>
+        </w:r>
+        <w:r>
+          <w:rPr>
+            <w:rFonts w:asciiTheme="minorHAnsi" w:eastAsiaTheme="minorEastAsia" w:hAnsiTheme="minorHAnsi"/>
+            <w:noProof/>
+            <w:kern w:val="2"/>
+            <w:szCs w:val="24"/>
+            <w:lang w:eastAsia="es-PE"/>
+            <w14:ligatures w14:val="standardContextual"/>
+          </w:rPr>
+          <w:tab/>
+        </w:r>
+        <w:r>
+          <w:rPr>
+            <w:rStyle w:val="Hipervnculo"/>
+            <w:noProof/>
+          </w:rPr>
+          <w:t>Resultados de Validación con Usuarios</w:t>
+        </w:r>
+        <w:r>
+          <w:rPr>
+            <w:noProof/>
+            <w:webHidden/>
+          </w:rPr>
+          <w:tab/>
+        </w:r>
+        <w:r>
+          <w:rPr>
+            <w:noProof/>
+            <w:webHidden/>
+          </w:rPr>
+          <w:fldChar w:fldCharType="begin"/>
+        </w:r>
+        <w:r>
+          <w:rPr>
+            <w:noProof/>
+            <w:webHidden/>
+          </w:rPr>
+          <w:instrText xml:space="preserve"> PAGEREF _Toc232757488 \h </w:instrText>
+        </w:r>
+        <w:r>
+          <w:rPr>
+            <w:noProof/>
+            <w:webHidden/>
+          </w:rPr>
+        </w:r>
+        <w:r>
+          <w:rPr>
+            <w:noProof/>
+            <w:webHidden/>
+          </w:rPr>
+          <w:fldChar w:fldCharType="separate"/>
+        </w:r>
+        <w:r>
+          <w:rPr>
+            <w:noProof/>
+            <w:webHidden/>
+          </w:rPr>
+          <w:t>15</w:t>
+        </w:r>
+        <w:r>
+          <w:rPr>
+            <w:noProof/>
+            <w:webHidden/>
+          </w:rPr>
+          <w:fldChar w:fldCharType="end"/>
+        </w:r>
+      </w:hyperlink>
+    </w:p>
+    <w:p>
+      <w:pPr>
+        <w:pStyle w:val="TDC1"/>
+        <w:tabs>
+          <w:tab w:val="right" w:leader="dot" w:pos="9016"/>
+        </w:tabs>
+        <w:rPr>
+          <w:rFonts w:asciiTheme="minorHAnsi" w:eastAsiaTheme="minorEastAsia" w:hAnsiTheme="minorHAnsi"/>
+          <w:noProof/>
+          <w:kern w:val="2"/>
+          <w:szCs w:val="24"/>
+          <w:lang w:eastAsia="es-PE"/>
+          <w14:ligatures w14:val="standardContextual"/>
+        </w:rPr>
+      </w:pPr>
+      <w:hyperlink w:anchor="_Toc232757489" w:history="1">
+        <w:r>
+          <w:rPr>
+            <w:rStyle w:val="Hipervnculo"/>
+            <w:noProof/>
+          </w:rPr>
+          <w:t>CAPÍTULO III</w:t>
+        </w:r>
+        <w:r>
+          <w:rPr>
+            <w:noProof/>
+            <w:webHidden/>
+          </w:rPr>
+          <w:tab/>
+        </w:r>
+        <w:r>
+          <w:rPr>
+            <w:noProof/>
+            <w:webHidden/>
+          </w:rPr>
+          <w:fldChar w:fldCharType="begin"/>
+        </w:r>
+        <w:r>
+          <w:rPr>
+            <w:noProof/>
+            <w:webHidden/>
+          </w:rPr>
+          <w:instrText xml:space="preserve"> PAGEREF _Toc232757489 \h </w:instrText>
+        </w:r>
+        <w:r>
+          <w:rPr>
+            <w:noProof/>
+            <w:webHidden/>
+          </w:rPr>
+        </w:r>
+        <w:r>
+          <w:rPr>
+            <w:noProof/>
+            <w:webHidden/>
+          </w:rPr>
+          <w:fldChar w:fldCharType="separate"/>
+        </w:r>
+        <w:r>
+          <w:rPr>
+            <w:noProof/>
+            <w:webHidden/>
+          </w:rPr>
+          <w:t>16</w:t>
+        </w:r>
+        <w:r>
+          <w:rPr>
+            <w:noProof/>
+            <w:webHidden/>
+          </w:rPr>
+          <w:fldChar w:fldCharType="end"/>
+        </w:r>
+      </w:hyperlink>
+    </w:p>
+    <w:p>
+      <w:pPr>
+        <w:pStyle w:val="TDC2"/>
+        <w:tabs>
+          <w:tab w:val="left" w:pos="720"/>
+          <w:tab w:val="right" w:leader="dot" w:pos="9016"/>
+        </w:tabs>
+        <w:rPr>
+          <w:rFonts w:asciiTheme="minorHAnsi" w:eastAsiaTheme="minorEastAsia" w:hAnsiTheme="minorHAnsi"/>
+          <w:noProof/>
+          <w:kern w:val="2"/>
+          <w:szCs w:val="24"/>
+          <w:lang w:eastAsia="es-PE"/>
+          <w14:ligatures w14:val="standardContextual"/>
+        </w:rPr>
+      </w:pPr>
+      <w:hyperlink w:anchor="_Toc232757490" w:history="1">
+        <w:r>
+          <w:rPr>
+            <w:rStyle w:val="Hipervnculo"/>
+            <w:noProof/>
+          </w:rPr>
+          <w:t>6.</w:t>
+        </w:r>
+        <w:r>
+          <w:rPr>
+            <w:rFonts w:asciiTheme="minorHAnsi" w:eastAsiaTheme="minorEastAsia" w:hAnsiTheme="minorHAnsi"/>
+            <w:noProof/>
+            <w:kern w:val="2"/>
+            <w:szCs w:val="24"/>
+            <w:lang w:eastAsia="es-PE"/>
+            <w14:ligatures w14:val="standardContextual"/>
+          </w:rPr>
+          <w:tab/>
+        </w:r>
+        <w:r>
+          <w:rPr>
+            <w:rStyle w:val="Hipervnculo"/>
+            <w:noProof/>
+          </w:rPr>
           <w:t>Conclusiones y aprendizajes</w:t>
         </w:r>
         <w:r>
@@ -2535,7 +3553,7 @@
             <w:noProof/>
             <w:webHidden/>
           </w:rPr>
-          <w:instrText xml:space="preserve"> PAGEREF _Toc232690664 \h </w:instrText>
+          <w:instrText xml:space="preserve"> PAGEREF _Toc232757490 \h </w:instrText>
         </w:r>
         <w:r>
           <w:rPr>
@@ -2555,7 +3573,375 @@
             <w:noProof/>
             <w:webHidden/>
           </w:rPr>
-          <w:t>13</w:t>
+          <w:t>16</w:t>
+        </w:r>
+        <w:r>
+          <w:rPr>
+            <w:noProof/>
+            <w:webHidden/>
+          </w:rPr>
+          <w:fldChar w:fldCharType="end"/>
+        </w:r>
+      </w:hyperlink>
+    </w:p>
+    <w:p>
+      <w:pPr>
+        <w:pStyle w:val="TDC3"/>
+        <w:tabs>
+          <w:tab w:val="left" w:pos="1200"/>
+          <w:tab w:val="right" w:leader="dot" w:pos="9016"/>
+        </w:tabs>
+        <w:rPr>
+          <w:rFonts w:asciiTheme="minorHAnsi" w:eastAsiaTheme="minorEastAsia" w:hAnsiTheme="minorHAnsi"/>
+          <w:noProof/>
+          <w:kern w:val="2"/>
+          <w:szCs w:val="24"/>
+          <w:lang w:eastAsia="es-PE"/>
+          <w14:ligatures w14:val="standardContextual"/>
+        </w:rPr>
+      </w:pPr>
+      <w:hyperlink w:anchor="_Toc232757491" w:history="1">
+        <w:r>
+          <w:rPr>
+            <w:rStyle w:val="Hipervnculo"/>
+            <w:noProof/>
+          </w:rPr>
+          <w:t>6.1.</w:t>
+        </w:r>
+        <w:r>
+          <w:rPr>
+            <w:rFonts w:asciiTheme="minorHAnsi" w:eastAsiaTheme="minorEastAsia" w:hAnsiTheme="minorHAnsi"/>
+            <w:noProof/>
+            <w:kern w:val="2"/>
+            <w:szCs w:val="24"/>
+            <w:lang w:eastAsia="es-PE"/>
+            <w14:ligatures w14:val="standardContextual"/>
+          </w:rPr>
+          <w:tab/>
+        </w:r>
+        <w:r>
+          <w:rPr>
+            <w:rStyle w:val="Hipervnculo"/>
+            <w:noProof/>
+          </w:rPr>
+          <w:t>Reflexión técnica</w:t>
+        </w:r>
+        <w:r>
+          <w:rPr>
+            <w:noProof/>
+            <w:webHidden/>
+          </w:rPr>
+          <w:tab/>
+        </w:r>
+        <w:r>
+          <w:rPr>
+            <w:noProof/>
+            <w:webHidden/>
+          </w:rPr>
+          <w:fldChar w:fldCharType="begin"/>
+        </w:r>
+        <w:r>
+          <w:rPr>
+            <w:noProof/>
+            <w:webHidden/>
+          </w:rPr>
+          <w:instrText xml:space="preserve"> PAGEREF _Toc232757491 \h </w:instrText>
+        </w:r>
+        <w:r>
+          <w:rPr>
+            <w:noProof/>
+            <w:webHidden/>
+          </w:rPr>
+        </w:r>
+        <w:r>
+          <w:rPr>
+            <w:noProof/>
+            <w:webHidden/>
+          </w:rPr>
+          <w:fldChar w:fldCharType="separate"/>
+        </w:r>
+        <w:r>
+          <w:rPr>
+            <w:noProof/>
+            <w:webHidden/>
+          </w:rPr>
+          <w:t>16</w:t>
+        </w:r>
+        <w:r>
+          <w:rPr>
+            <w:noProof/>
+            <w:webHidden/>
+          </w:rPr>
+          <w:fldChar w:fldCharType="end"/>
+        </w:r>
+      </w:hyperlink>
+    </w:p>
+    <w:p>
+      <w:pPr>
+        <w:pStyle w:val="TDC3"/>
+        <w:tabs>
+          <w:tab w:val="left" w:pos="1200"/>
+          <w:tab w:val="right" w:leader="dot" w:pos="9016"/>
+        </w:tabs>
+        <w:rPr>
+          <w:rFonts w:asciiTheme="minorHAnsi" w:eastAsiaTheme="minorEastAsia" w:hAnsiTheme="minorHAnsi"/>
+          <w:noProof/>
+          <w:kern w:val="2"/>
+          <w:szCs w:val="24"/>
+          <w:lang w:eastAsia="es-PE"/>
+          <w14:ligatures w14:val="standardContextual"/>
+        </w:rPr>
+      </w:pPr>
+      <w:hyperlink w:anchor="_Toc232757492" w:history="1">
+        <w:r>
+          <w:rPr>
+            <w:rStyle w:val="Hipervnculo"/>
+            <w:noProof/>
+          </w:rPr>
+          <w:t>6.2.</w:t>
+        </w:r>
+        <w:r>
+          <w:rPr>
+            <w:rFonts w:asciiTheme="minorHAnsi" w:eastAsiaTheme="minorEastAsia" w:hAnsiTheme="minorHAnsi"/>
+            <w:noProof/>
+            <w:kern w:val="2"/>
+            <w:szCs w:val="24"/>
+            <w:lang w:eastAsia="es-PE"/>
+            <w14:ligatures w14:val="standardContextual"/>
+          </w:rPr>
+          <w:tab/>
+        </w:r>
+        <w:r>
+          <w:rPr>
+            <w:rStyle w:val="Hipervnculo"/>
+            <w:noProof/>
+          </w:rPr>
+          <w:t>Impacto Social</w:t>
+        </w:r>
+        <w:r>
+          <w:rPr>
+            <w:noProof/>
+            <w:webHidden/>
+          </w:rPr>
+          <w:tab/>
+        </w:r>
+        <w:r>
+          <w:rPr>
+            <w:noProof/>
+            <w:webHidden/>
+          </w:rPr>
+          <w:fldChar w:fldCharType="begin"/>
+        </w:r>
+        <w:r>
+          <w:rPr>
+            <w:noProof/>
+            <w:webHidden/>
+          </w:rPr>
+          <w:instrText xml:space="preserve"> PAGEREF _Toc232757492 \h </w:instrText>
+        </w:r>
+        <w:r>
+          <w:rPr>
+            <w:noProof/>
+            <w:webHidden/>
+          </w:rPr>
+        </w:r>
+        <w:r>
+          <w:rPr>
+            <w:noProof/>
+            <w:webHidden/>
+          </w:rPr>
+          <w:fldChar w:fldCharType="separate"/>
+        </w:r>
+        <w:r>
+          <w:rPr>
+            <w:noProof/>
+            <w:webHidden/>
+          </w:rPr>
+          <w:t>16</w:t>
+        </w:r>
+        <w:r>
+          <w:rPr>
+            <w:noProof/>
+            <w:webHidden/>
+          </w:rPr>
+          <w:fldChar w:fldCharType="end"/>
+        </w:r>
+      </w:hyperlink>
+    </w:p>
+    <w:p>
+      <w:pPr>
+        <w:pStyle w:val="TDC3"/>
+        <w:tabs>
+          <w:tab w:val="left" w:pos="1200"/>
+          <w:tab w:val="right" w:leader="dot" w:pos="9016"/>
+        </w:tabs>
+        <w:rPr>
+          <w:rFonts w:asciiTheme="minorHAnsi" w:eastAsiaTheme="minorEastAsia" w:hAnsiTheme="minorHAnsi"/>
+          <w:noProof/>
+          <w:kern w:val="2"/>
+          <w:szCs w:val="24"/>
+          <w:lang w:eastAsia="es-PE"/>
+          <w14:ligatures w14:val="standardContextual"/>
+        </w:rPr>
+      </w:pPr>
+      <w:hyperlink w:anchor="_Toc232757493" w:history="1">
+        <w:r>
+          <w:rPr>
+            <w:rStyle w:val="Hipervnculo"/>
+            <w:noProof/>
+          </w:rPr>
+          <w:t>6.3.</w:t>
+        </w:r>
+        <w:r>
+          <w:rPr>
+            <w:rFonts w:asciiTheme="minorHAnsi" w:eastAsiaTheme="minorEastAsia" w:hAnsiTheme="minorHAnsi"/>
+            <w:noProof/>
+            <w:kern w:val="2"/>
+            <w:szCs w:val="24"/>
+            <w:lang w:eastAsia="es-PE"/>
+            <w14:ligatures w14:val="standardContextual"/>
+          </w:rPr>
+          <w:tab/>
+        </w:r>
+        <w:r>
+          <w:rPr>
+            <w:rStyle w:val="Hipervnculo"/>
+            <w:noProof/>
+          </w:rPr>
+          <w:t>Lecciones aprendidas</w:t>
+        </w:r>
+        <w:r>
+          <w:rPr>
+            <w:noProof/>
+            <w:webHidden/>
+          </w:rPr>
+          <w:tab/>
+        </w:r>
+        <w:r>
+          <w:rPr>
+            <w:noProof/>
+            <w:webHidden/>
+          </w:rPr>
+          <w:fldChar w:fldCharType="begin"/>
+        </w:r>
+        <w:r>
+          <w:rPr>
+            <w:noProof/>
+            <w:webHidden/>
+          </w:rPr>
+          <w:instrText xml:space="preserve"> PAGEREF _Toc232757493 \h </w:instrText>
+        </w:r>
+        <w:r>
+          <w:rPr>
+            <w:noProof/>
+            <w:webHidden/>
+          </w:rPr>
+        </w:r>
+        <w:r>
+          <w:rPr>
+            <w:noProof/>
+            <w:webHidden/>
+          </w:rPr>
+          <w:fldChar w:fldCharType="separate"/>
+        </w:r>
+        <w:r>
+          <w:rPr>
+            <w:noProof/>
+            <w:webHidden/>
+          </w:rPr>
+          <w:t>16</w:t>
+        </w:r>
+        <w:r>
+          <w:rPr>
+            <w:noProof/>
+            <w:webHidden/>
+          </w:rPr>
+          <w:fldChar w:fldCharType="end"/>
+        </w:r>
+      </w:hyperlink>
+    </w:p>
+    <w:p>
+      <w:pPr>
+        <w:pStyle w:val="TDC3"/>
+        <w:tabs>
+          <w:tab w:val="left" w:pos="1200"/>
+          <w:tab w:val="right" w:leader="dot" w:pos="9016"/>
+        </w:tabs>
+        <w:rPr>
+          <w:rFonts w:asciiTheme="minorHAnsi" w:eastAsiaTheme="minorEastAsia" w:hAnsiTheme="minorHAnsi"/>
+          <w:noProof/>
+          <w:kern w:val="2"/>
+          <w:szCs w:val="24"/>
+          <w:lang w:eastAsia="es-PE"/>
+          <w14:ligatures w14:val="standardContextual"/>
+        </w:rPr>
+      </w:pPr>
+      <w:hyperlink w:anchor="_Toc232757494" w:history="1">
+        <w:r>
+          <w:rPr>
+            <w:rStyle w:val="Hipervnculo"/>
+            <w:noProof/>
+          </w:rPr>
+          <w:t>6.4.</w:t>
+        </w:r>
+        <w:r>
+          <w:rPr>
+            <w:rFonts w:asciiTheme="minorHAnsi" w:eastAsiaTheme="minorEastAsia" w:hAnsiTheme="minorHAnsi"/>
+            <w:noProof/>
+            <w:kern w:val="2"/>
+            <w:szCs w:val="24"/>
+            <w:lang w:eastAsia="es-PE"/>
+            <w14:ligatures w14:val="standardContextual"/>
+          </w:rPr>
+          <w:tab/>
+        </w:r>
+        <w:r>
+          <w:rPr>
+            <w:rStyle w:val="Hipervnculo"/>
+            <w:noProof/>
+          </w:rPr>
+          <w:t>Mejoras futuras</w:t>
+        </w:r>
+        <w:r>
+          <w:rPr>
+            <w:noProof/>
+            <w:webHidden/>
+          </w:rPr>
+          <w:tab/>
+        </w:r>
+        <w:r>
+          <w:rPr>
+            <w:noProof/>
+            <w:webHidden/>
+          </w:rPr>
+          <w:fldChar w:fldCharType="begin"/>
+        </w:r>
+        <w:r>
+          <w:rPr>
+            <w:noProof/>
+            <w:webHidden/>
+          </w:rPr>
+          <w:instrText xml:space="preserve"> PAGEREF _Toc232757494 \h </w:instrText>
+        </w:r>
+        <w:r>
+          <w:rPr>
+            <w:noProof/>
+            <w:webHidden/>
+          </w:rPr>
+        </w:r>
+        <w:r>
+          <w:rPr>
+            <w:noProof/>
+            <w:webHidden/>
+          </w:rPr>
+          <w:fldChar w:fldCharType="separate"/>
+        </w:r>
+        <w:r>
+          <w:rPr>
+            <w:noProof/>
+            <w:webHidden/>
+          </w:rPr>
+          <w:t>16</w:t>
         </w:r>
         <w:r>
           <w:rPr>
@@ -2613,7 +3999,7 @@
       <w:pPr>
         <w:pStyle w:val="Ttulo1"/>
       </w:pPr>
-      <w:bookmarkStart w:id="0" w:name="_Toc232690649"/>
+      <w:bookmarkStart w:id="0" w:name="_Toc232757464"/>
       <w:r>
         <w:lastRenderedPageBreak/>
         <w:t>CAPÍTULO I</w:t>
@@ -2624,7 +4010,7 @@
       <w:pPr>
         <w:pStyle w:val="Ttulo2"/>
       </w:pPr>
-      <w:bookmarkStart w:id="1" w:name="_Toc232690650"/>
+      <w:bookmarkStart w:id="1" w:name="_Toc232757465"/>
       <w:r>
         <w:t xml:space="preserve">Identificación </w:t>
       </w:r>
@@ -2659,7 +4045,7 @@
       <w:r>
         <w:t xml:space="preserve"> </w:t>
       </w:r>
-      <w:bookmarkStart w:id="2" w:name="_Toc232690651"/>
+      <w:bookmarkStart w:id="2" w:name="_Toc232757466"/>
       <w:r>
         <w:t>Limitaciones identificadas</w:t>
       </w:r>
@@ -2760,7 +4146,7 @@
       <w:r>
         <w:t xml:space="preserve"> </w:t>
       </w:r>
-      <w:bookmarkStart w:id="3" w:name="_Toc232690652"/>
+      <w:bookmarkStart w:id="3" w:name="_Toc232757467"/>
       <w:r>
         <w:t>Entrevistas Breves a los Representantes</w:t>
       </w:r>
@@ -3138,7 +4524,7 @@
       <w:pPr>
         <w:pStyle w:val="Ttulo3"/>
       </w:pPr>
-      <w:bookmarkStart w:id="4" w:name="_Toc232690653"/>
+      <w:bookmarkStart w:id="4" w:name="_Toc232757468"/>
       <w:r>
         <w:t>Perfiles de usuario</w:t>
       </w:r>
@@ -3943,7 +5329,7 @@
       <w:pPr>
         <w:pStyle w:val="Ttulo2"/>
       </w:pPr>
-      <w:bookmarkStart w:id="5" w:name="_Toc232690654"/>
+      <w:bookmarkStart w:id="5" w:name="_Toc232757469"/>
       <w:r>
         <w:t>Justificación técnica y ética</w:t>
       </w:r>
@@ -3956,7 +5342,7 @@
       <w:r>
         <w:t xml:space="preserve"> </w:t>
       </w:r>
-      <w:bookmarkStart w:id="6" w:name="_Toc232690655"/>
+      <w:bookmarkStart w:id="6" w:name="_Toc232757470"/>
       <w:r>
         <w:t>Problema delimitado</w:t>
       </w:r>
@@ -4069,7 +5455,7 @@
       <w:r>
         <w:t xml:space="preserve"> </w:t>
       </w:r>
-      <w:bookmarkStart w:id="7" w:name="_Toc232690656"/>
+      <w:bookmarkStart w:id="7" w:name="_Toc232757471"/>
       <w:r>
         <w:t>Objetivo General</w:t>
       </w:r>
@@ -4106,7 +5492,7 @@
       <w:r>
         <w:t xml:space="preserve"> </w:t>
       </w:r>
-      <w:bookmarkStart w:id="8" w:name="_Toc232690657"/>
+      <w:bookmarkStart w:id="8" w:name="_Toc232757472"/>
       <w:r>
         <w:t>Objetivos</w:t>
       </w:r>
@@ -4306,7 +5692,7 @@
       <w:pPr>
         <w:pStyle w:val="Ttulo3"/>
       </w:pPr>
-      <w:bookmarkStart w:id="9" w:name="_Toc232690658"/>
+      <w:bookmarkStart w:id="9" w:name="_Toc232757473"/>
       <w:r>
         <w:lastRenderedPageBreak/>
         <w:t>Mapa de Empatía</w:t>
@@ -4393,7 +5779,7 @@
       <w:pPr>
         <w:pStyle w:val="Ttulo1"/>
       </w:pPr>
-      <w:bookmarkStart w:id="10" w:name="_Toc232690659"/>
+      <w:bookmarkStart w:id="10" w:name="_Toc232757474"/>
       <w:r>
         <w:lastRenderedPageBreak/>
         <w:t>CAPÍTULO II</w:t>
@@ -4404,7 +5790,7 @@
       <w:pPr>
         <w:pStyle w:val="Ttulo2"/>
       </w:pPr>
-      <w:bookmarkStart w:id="11" w:name="_Toc232690660"/>
+      <w:bookmarkStart w:id="11" w:name="_Toc232757475"/>
       <w:r>
         <w:t>Arquitectura y tecnologías empleadas</w:t>
       </w:r>
@@ -4412,132 +5798,756 @@
     </w:p>
     <w:p>
       <w:pPr>
-        <w:pStyle w:val="Prrafodelista"/>
-        <w:spacing w:line="360" w:lineRule="auto"/>
-        <w:jc w:val="both"/>
-        <w:rPr>
-          <w:rFonts w:ascii="Times New Roman" w:hAnsi="Times New Roman" w:cs="Times New Roman"/>
-          <w:sz w:val="24"/>
-          <w:szCs w:val="24"/>
-        </w:rPr>
-      </w:pPr>
-      <w:r>
-        <w:rPr>
-          <w:rFonts w:ascii="Times New Roman" w:hAnsi="Times New Roman" w:cs="Times New Roman"/>
-          <w:sz w:val="24"/>
-          <w:szCs w:val="24"/>
-        </w:rPr>
-        <w:t>Explica y describe todas las ideas innovadoras consideradas para la solución.</w:t>
+        <w:pStyle w:val="APATMA"/>
+      </w:pPr>
+      <w:r>
+        <w:t xml:space="preserve">Para solucionar los problemas de desconexión </w:t>
+      </w:r>
+      <w:proofErr w:type="spellStart"/>
+      <w:r>
+        <w:t>post-feria</w:t>
+      </w:r>
+      <w:proofErr w:type="spellEnd"/>
+      <w:r>
+        <w:t xml:space="preserve">, la falta de visualización del stock real y la incertidumbre de localización que padece el emprendimiento </w:t>
+      </w:r>
+      <w:r>
+        <w:rPr>
+          <w:b/>
+          <w:bCs/>
+        </w:rPr>
+        <w:t xml:space="preserve">MC </w:t>
+      </w:r>
+      <w:proofErr w:type="spellStart"/>
+      <w:r>
+        <w:rPr>
+          <w:b/>
+          <w:bCs/>
+        </w:rPr>
+        <w:t>BackPack</w:t>
+      </w:r>
+      <w:proofErr w:type="spellEnd"/>
+      <w:r>
+        <w:t xml:space="preserve">, se ha estructurado una solución basada en el patrón arquitectónico </w:t>
+      </w:r>
+      <w:r>
+        <w:rPr>
+          <w:b/>
+          <w:bCs/>
+        </w:rPr>
+        <w:t>Cliente-Servidor</w:t>
+      </w:r>
+      <w:r>
+        <w:t>. Esta arquitectura separa limpiamente la interfaz interactiva consumida por los clientes del motor lógico y almacenamiento que administra la empresaria.</w:t>
+      </w:r>
+    </w:p>
+    <w:p>
+      <w:pPr>
+        <w:pStyle w:val="Ttulo3"/>
+      </w:pPr>
+      <w:r>
+        <w:t xml:space="preserve"> </w:t>
+      </w:r>
+      <w:bookmarkStart w:id="12" w:name="_Toc232757476"/>
+      <w:r>
+        <w:t>Diagrama Detallado de la Arquitectura Cliente – Servidor</w:t>
+      </w:r>
+      <w:bookmarkEnd w:id="12"/>
+    </w:p>
+    <w:p>
+      <w:pPr>
+        <w:pStyle w:val="APATMA"/>
+        <w:ind w:left="11"/>
+      </w:pPr>
+      <w:r>
+        <w:t>A continuación, se describe y presenta la topología de la aplicación web y el flojo de datos asíncrono diseñado:</w:t>
+      </w:r>
+    </w:p>
+    <w:p>
+      <w:pPr>
+        <w:pStyle w:val="APATMA"/>
+        <w:ind w:left="11"/>
+        <w:rPr>
+          <w:i/>
+          <w:iCs/>
+        </w:rPr>
+      </w:pPr>
+      <w:r>
+        <w:rPr>
+          <w:i/>
+          <w:iCs/>
+        </w:rPr>
+        <w:t>“Insertar el diagrama”</w:t>
+      </w:r>
+    </w:p>
+    <w:p>
+      <w:pPr>
+        <w:pStyle w:val="Ttulo3"/>
+      </w:pPr>
+      <w:r>
+        <w:t xml:space="preserve"> </w:t>
+      </w:r>
+      <w:bookmarkStart w:id="13" w:name="_Toc232757477"/>
+      <w:r>
+        <w:t>Justificación del Stack Tecnológico (Mobile – First y Rendimiento)</w:t>
+      </w:r>
+      <w:bookmarkEnd w:id="13"/>
+    </w:p>
+    <w:p>
+      <w:pPr>
+        <w:pStyle w:val="APATMA"/>
+      </w:pPr>
+      <w:r>
+        <w:t>El ecosistema de herramientas ha sido seleccionado de forma estratégica para mitigar las limitaciones tecnológicas identificadas en las entrevistas:</w:t>
+      </w:r>
+    </w:p>
+    <w:tbl>
+      <w:tblPr>
+        <w:tblStyle w:val="Tablaconcuadrcula"/>
+        <w:tblW w:w="0" w:type="auto"/>
+        <w:tblLook w:val="04A0" w:firstRow="1" w:lastRow="0" w:firstColumn="1" w:lastColumn="0" w:noHBand="0" w:noVBand="1"/>
+      </w:tblPr>
+      <w:tblGrid>
+        <w:gridCol w:w="2122"/>
+        <w:gridCol w:w="2551"/>
+        <w:gridCol w:w="4343"/>
+      </w:tblGrid>
+      <w:tr>
+        <w:tc>
+          <w:tcPr>
+            <w:tcW w:w="2122" w:type="dxa"/>
+            <w:vAlign w:val="center"/>
+          </w:tcPr>
+          <w:p>
+            <w:pPr>
+              <w:pStyle w:val="APATMA"/>
+              <w:spacing w:line="240" w:lineRule="auto"/>
+              <w:ind w:firstLine="0"/>
+              <w:jc w:val="left"/>
+              <w:rPr>
+                <w:b/>
+                <w:bCs/>
+              </w:rPr>
+            </w:pPr>
+            <w:r>
+              <w:rPr>
+                <w:b/>
+                <w:bCs/>
+              </w:rPr>
+              <w:t>Componente</w:t>
+            </w:r>
+          </w:p>
+        </w:tc>
+        <w:tc>
+          <w:tcPr>
+            <w:tcW w:w="2551" w:type="dxa"/>
+            <w:vAlign w:val="center"/>
+          </w:tcPr>
+          <w:p>
+            <w:pPr>
+              <w:pStyle w:val="APATMA"/>
+              <w:spacing w:line="240" w:lineRule="auto"/>
+              <w:ind w:firstLine="0"/>
+              <w:jc w:val="left"/>
+              <w:rPr>
+                <w:b/>
+                <w:bCs/>
+              </w:rPr>
+            </w:pPr>
+            <w:r>
+              <w:rPr>
+                <w:b/>
+                <w:bCs/>
+              </w:rPr>
+              <w:t>Tecnología Seleccionada</w:t>
+            </w:r>
+          </w:p>
+        </w:tc>
+        <w:tc>
+          <w:tcPr>
+            <w:tcW w:w="4343" w:type="dxa"/>
+            <w:vAlign w:val="center"/>
+          </w:tcPr>
+          <w:p>
+            <w:pPr>
+              <w:pStyle w:val="APATMA"/>
+              <w:spacing w:line="240" w:lineRule="auto"/>
+              <w:ind w:firstLine="0"/>
+              <w:rPr>
+                <w:b/>
+                <w:bCs/>
+              </w:rPr>
+            </w:pPr>
+            <w:r>
+              <w:rPr>
+                <w:b/>
+                <w:bCs/>
+              </w:rPr>
+              <w:t>Justificación Técnica Orientada al Usuario</w:t>
+            </w:r>
+          </w:p>
+        </w:tc>
+      </w:tr>
+      <w:tr>
+        <w:tc>
+          <w:tcPr>
+            <w:tcW w:w="2122" w:type="dxa"/>
+          </w:tcPr>
+          <w:p>
+            <w:pPr>
+              <w:pStyle w:val="APATMA"/>
+              <w:spacing w:line="240" w:lineRule="auto"/>
+              <w:ind w:firstLine="0"/>
+            </w:pPr>
+            <w:r>
+              <w:t>Estructura</w:t>
+            </w:r>
+          </w:p>
+        </w:tc>
+        <w:tc>
+          <w:tcPr>
+            <w:tcW w:w="2551" w:type="dxa"/>
+          </w:tcPr>
+          <w:p>
+            <w:pPr>
+              <w:pStyle w:val="APATMA"/>
+              <w:spacing w:line="240" w:lineRule="auto"/>
+              <w:ind w:firstLine="0"/>
+            </w:pPr>
+            <w:r>
+              <w:t>HTML5 Semántico</w:t>
+            </w:r>
+          </w:p>
+        </w:tc>
+        <w:tc>
+          <w:tcPr>
+            <w:tcW w:w="4343" w:type="dxa"/>
+          </w:tcPr>
+          <w:p>
+            <w:pPr>
+              <w:pStyle w:val="APATMA"/>
+              <w:spacing w:line="240" w:lineRule="auto"/>
+              <w:ind w:firstLine="0"/>
+            </w:pPr>
+            <w:r>
+              <w:t>Garantiza un árbol de accesibilidad idóneo (puntuación Lighthouse &gt; 80). Permite que los textos sean legibles y estructurados para usuarias de la tercera edad como María.</w:t>
+            </w:r>
+          </w:p>
+        </w:tc>
+      </w:tr>
+      <w:tr>
+        <w:tc>
+          <w:tcPr>
+            <w:tcW w:w="2122" w:type="dxa"/>
+          </w:tcPr>
+          <w:p>
+            <w:pPr>
+              <w:pStyle w:val="APATMA"/>
+              <w:spacing w:line="240" w:lineRule="auto"/>
+              <w:ind w:firstLine="0"/>
+            </w:pPr>
+            <w:r>
+              <w:t>Estilos UI</w:t>
+            </w:r>
+          </w:p>
+        </w:tc>
+        <w:tc>
+          <w:tcPr>
+            <w:tcW w:w="2551" w:type="dxa"/>
+          </w:tcPr>
+          <w:p>
+            <w:pPr>
+              <w:pStyle w:val="APATMA"/>
+              <w:spacing w:line="240" w:lineRule="auto"/>
+              <w:ind w:firstLine="0"/>
+            </w:pPr>
+            <w:r>
+              <w:t>Bootstrap 5 + CSS3</w:t>
+            </w:r>
+          </w:p>
+        </w:tc>
+        <w:tc>
+          <w:tcPr>
+            <w:tcW w:w="4343" w:type="dxa"/>
+          </w:tcPr>
+          <w:p>
+            <w:pPr>
+              <w:pStyle w:val="APATMA"/>
+              <w:spacing w:line="240" w:lineRule="auto"/>
+              <w:ind w:firstLine="0"/>
+            </w:pPr>
+            <w:r>
+              <w:t xml:space="preserve">Framework optimizando para diseños </w:t>
+            </w:r>
+            <w:proofErr w:type="spellStart"/>
+            <w:r>
+              <w:rPr>
+                <w:i/>
+                <w:iCs/>
+              </w:rPr>
+              <w:t>mobile</w:t>
+            </w:r>
+            <w:proofErr w:type="spellEnd"/>
+            <w:r>
+              <w:rPr>
+                <w:i/>
+                <w:iCs/>
+              </w:rPr>
+              <w:t xml:space="preserve"> – </w:t>
+            </w:r>
+            <w:proofErr w:type="spellStart"/>
+            <w:r>
+              <w:rPr>
+                <w:i/>
+                <w:iCs/>
+              </w:rPr>
+              <w:t>first</w:t>
+            </w:r>
+            <w:proofErr w:type="spellEnd"/>
+            <w:r>
+              <w:t>. Permite crear grillas elásticas que adaptan las fotos de las mochilas al instante en el móvil de Eduardo o de Madai sin romper el diseño.</w:t>
+            </w:r>
+          </w:p>
+        </w:tc>
+      </w:tr>
+      <w:tr>
+        <w:tc>
+          <w:tcPr>
+            <w:tcW w:w="2122" w:type="dxa"/>
+          </w:tcPr>
+          <w:p>
+            <w:pPr>
+              <w:pStyle w:val="APATMA"/>
+              <w:spacing w:line="240" w:lineRule="auto"/>
+              <w:ind w:firstLine="0"/>
+            </w:pPr>
+            <w:r>
+              <w:t>Interactividad</w:t>
+            </w:r>
+          </w:p>
+        </w:tc>
+        <w:tc>
+          <w:tcPr>
+            <w:tcW w:w="2551" w:type="dxa"/>
+          </w:tcPr>
+          <w:p>
+            <w:pPr>
+              <w:pStyle w:val="APATMA"/>
+              <w:spacing w:line="240" w:lineRule="auto"/>
+              <w:ind w:firstLine="0"/>
+            </w:pPr>
+            <w:r>
+              <w:t>JavaScript</w:t>
+            </w:r>
+          </w:p>
+        </w:tc>
+        <w:tc>
+          <w:tcPr>
+            <w:tcW w:w="4343" w:type="dxa"/>
+          </w:tcPr>
+          <w:p>
+            <w:pPr>
+              <w:pStyle w:val="APATMA"/>
+              <w:spacing w:line="240" w:lineRule="auto"/>
+              <w:ind w:firstLine="0"/>
+            </w:pPr>
+            <w:r>
+              <w:t>Manipula de forma nativa el DOM para aplicar los filtros de mochilas (Nacionales vs. Importadas) que Eduardo exige en menos de 3 segundos, eliminando recargas innecesarias de página.</w:t>
+            </w:r>
+          </w:p>
+        </w:tc>
+      </w:tr>
+      <w:tr>
+        <w:tc>
+          <w:tcPr>
+            <w:tcW w:w="2122" w:type="dxa"/>
+          </w:tcPr>
+          <w:p>
+            <w:pPr>
+              <w:pStyle w:val="APATMA"/>
+              <w:spacing w:line="240" w:lineRule="auto"/>
+              <w:ind w:firstLine="0"/>
+            </w:pPr>
+            <w:r>
+              <w:lastRenderedPageBreak/>
+              <w:t>Servidor Lógico</w:t>
+            </w:r>
+          </w:p>
+        </w:tc>
+        <w:tc>
+          <w:tcPr>
+            <w:tcW w:w="2551" w:type="dxa"/>
+          </w:tcPr>
+          <w:p>
+            <w:pPr>
+              <w:pStyle w:val="APATMA"/>
+              <w:spacing w:line="240" w:lineRule="auto"/>
+              <w:ind w:firstLine="0"/>
+            </w:pPr>
+            <w:r>
+              <w:t>Node.js &amp; Express.js</w:t>
+            </w:r>
+          </w:p>
+        </w:tc>
+        <w:tc>
+          <w:tcPr>
+            <w:tcW w:w="4343" w:type="dxa"/>
+          </w:tcPr>
+          <w:p>
+            <w:pPr>
+              <w:pStyle w:val="APATMA"/>
+              <w:spacing w:line="240" w:lineRule="auto"/>
+              <w:ind w:firstLine="0"/>
+            </w:pPr>
+            <w:r>
+              <w:t>Entorno altamente escalable e ideal para procesar peticiones asíncronas concurrentes. Su enrutamiento directo permite a Madai actualizar datos de las ferias de manera óptima.</w:t>
+            </w:r>
+          </w:p>
+        </w:tc>
+      </w:tr>
+      <w:tr>
+        <w:tc>
+          <w:tcPr>
+            <w:tcW w:w="2122" w:type="dxa"/>
+          </w:tcPr>
+          <w:p>
+            <w:pPr>
+              <w:pStyle w:val="APATMA"/>
+              <w:spacing w:line="240" w:lineRule="auto"/>
+              <w:ind w:firstLine="0"/>
+            </w:pPr>
+            <w:r>
+              <w:t>Almacenamiento</w:t>
+            </w:r>
+          </w:p>
+        </w:tc>
+        <w:tc>
+          <w:tcPr>
+            <w:tcW w:w="2551" w:type="dxa"/>
+          </w:tcPr>
+          <w:p>
+            <w:pPr>
+              <w:pStyle w:val="APATMA"/>
+              <w:spacing w:line="240" w:lineRule="auto"/>
+              <w:ind w:firstLine="0"/>
+            </w:pPr>
+            <w:r>
+              <w:t>Archivos JSON</w:t>
+            </w:r>
+          </w:p>
+        </w:tc>
+        <w:tc>
+          <w:tcPr>
+            <w:tcW w:w="4343" w:type="dxa"/>
+          </w:tcPr>
+          <w:p>
+            <w:pPr>
+              <w:pStyle w:val="APATMA"/>
+              <w:spacing w:line="240" w:lineRule="auto"/>
+              <w:ind w:firstLine="0"/>
+            </w:pPr>
+            <w:r>
+              <w:t xml:space="preserve">Base de datos ligera basada en archivos de texto planos. Evite sobrecargar el servidor </w:t>
+            </w:r>
+            <w:proofErr w:type="spellStart"/>
+            <w:r>
+              <w:t>backend</w:t>
+            </w:r>
+            <w:proofErr w:type="spellEnd"/>
+            <w:r>
+              <w:t>, facilitando la lectura directa del stock y la edición ágil para el microempresario.</w:t>
+            </w:r>
+          </w:p>
+        </w:tc>
+      </w:tr>
+    </w:tbl>
+    <w:p>
+      <w:pPr>
+        <w:pStyle w:val="APATMA"/>
+      </w:pPr>
+    </w:p>
+    <w:p>
+      <w:pPr>
+        <w:pStyle w:val="Ttulo3"/>
+      </w:pPr>
+      <w:r>
+        <w:t xml:space="preserve"> </w:t>
+      </w:r>
+      <w:bookmarkStart w:id="14" w:name="_Toc232757478"/>
+      <w:r>
+        <w:t>Flujo de Navegación Coherente (</w:t>
+      </w:r>
+      <w:proofErr w:type="spellStart"/>
+      <w:r>
+        <w:t>User</w:t>
+      </w:r>
+      <w:proofErr w:type="spellEnd"/>
+      <w:r>
+        <w:t xml:space="preserve"> Flow)</w:t>
+      </w:r>
+      <w:bookmarkEnd w:id="14"/>
+    </w:p>
+    <w:p>
+      <w:pPr>
+        <w:pStyle w:val="APATMA"/>
+      </w:pPr>
+      <w:r>
+        <w:t xml:space="preserve">El mapa de navegación está estrictamente jerarquizado para asegurar dos condiciones críticas: La </w:t>
+      </w:r>
+      <w:r>
+        <w:rPr>
+          <w:b/>
+          <w:bCs/>
+        </w:rPr>
+        <w:t>rapidez</w:t>
+      </w:r>
+      <w:r>
+        <w:t xml:space="preserve"> que busca el usuario juvenil y la </w:t>
+      </w:r>
+      <w:r>
+        <w:rPr>
+          <w:b/>
+          <w:bCs/>
+        </w:rPr>
+        <w:t>simplicidad intuitiva</w:t>
+      </w:r>
+      <w:r>
+        <w:t xml:space="preserve"> que requiere el adulto mayor.</w:t>
+      </w:r>
+    </w:p>
+    <w:p>
+      <w:pPr>
+        <w:pStyle w:val="APATMA"/>
+      </w:pPr>
+      <w:r>
+        <w:t>“Insertar el Flujo de navegación”</w:t>
+      </w:r>
+    </w:p>
+    <w:p>
+      <w:pPr>
+        <w:pStyle w:val="Ttulo3"/>
+      </w:pPr>
+      <w:r>
+        <w:t xml:space="preserve"> </w:t>
+      </w:r>
+      <w:bookmarkStart w:id="15" w:name="_Toc232757479"/>
+      <w:r>
+        <w:t xml:space="preserve">Especificaciones de Diseño y Accesibilidad en </w:t>
+      </w:r>
+      <w:proofErr w:type="spellStart"/>
+      <w:r>
+        <w:t>Wireframes</w:t>
+      </w:r>
+      <w:bookmarkEnd w:id="15"/>
+      <w:proofErr w:type="spellEnd"/>
+    </w:p>
+    <w:p>
+      <w:pPr>
+        <w:pStyle w:val="APATMA"/>
+      </w:pPr>
+      <w:r>
+        <w:t xml:space="preserve">“Insertar los </w:t>
+      </w:r>
+      <w:proofErr w:type="spellStart"/>
+      <w:r>
+        <w:t>wireframes</w:t>
+      </w:r>
+      <w:proofErr w:type="spellEnd"/>
+      <w:r>
+        <w:t xml:space="preserve"> con su respectivo párrafo descriptivo.”</w:t>
+      </w:r>
+    </w:p>
+    <w:p>
+      <w:pPr>
+        <w:pStyle w:val="APATMA"/>
+        <w:ind w:left="11"/>
+      </w:pPr>
+    </w:p>
+    <w:p>
+      <w:pPr>
+        <w:pStyle w:val="APATMA"/>
+        <w:ind w:left="11"/>
+      </w:pPr>
+      <w:r>
+        <w:t>“Solo</w:t>
+      </w:r>
+      <w:r>
+        <w:t xml:space="preserve"> hasta el punto tres se trabaja (por ahora)”</w:t>
       </w:r>
     </w:p>
     <w:p>
       <w:pPr>
         <w:pStyle w:val="Ttulo2"/>
       </w:pPr>
-      <w:bookmarkStart w:id="12" w:name="_Toc232690661"/>
+      <w:bookmarkStart w:id="16" w:name="_Toc232757480"/>
       <w:r>
         <w:t>Descripción de funcionalidades</w:t>
       </w:r>
-      <w:bookmarkEnd w:id="12"/>
-    </w:p>
-    <w:p>
-      <w:pPr>
-        <w:pStyle w:val="Prrafodelista"/>
-        <w:spacing w:line="360" w:lineRule="auto"/>
-        <w:jc w:val="both"/>
-        <w:rPr>
-          <w:rFonts w:ascii="Times New Roman" w:hAnsi="Times New Roman" w:cs="Times New Roman"/>
-          <w:sz w:val="24"/>
-          <w:szCs w:val="24"/>
-        </w:rPr>
-      </w:pPr>
-      <w:r>
-        <w:rPr>
-          <w:rFonts w:ascii="Times New Roman" w:hAnsi="Times New Roman" w:cs="Times New Roman"/>
-          <w:sz w:val="24"/>
-          <w:szCs w:val="24"/>
-        </w:rPr>
-        <w:t>Elige una idea innovadora y c</w:t>
-      </w:r>
-      <w:r>
-        <w:rPr>
-          <w:rFonts w:ascii="Times New Roman" w:hAnsi="Times New Roman" w:cs="Times New Roman"/>
-          <w:sz w:val="24"/>
-          <w:szCs w:val="24"/>
-        </w:rPr>
-        <w:t xml:space="preserve">oloca el nombre a </w:t>
-      </w:r>
-      <w:r>
-        <w:rPr>
-          <w:rFonts w:ascii="Times New Roman" w:hAnsi="Times New Roman" w:cs="Times New Roman"/>
-          <w:sz w:val="24"/>
-          <w:szCs w:val="24"/>
-        </w:rPr>
-        <w:t>dich</w:t>
-      </w:r>
-      <w:r>
-        <w:rPr>
-          <w:rFonts w:ascii="Times New Roman" w:hAnsi="Times New Roman" w:cs="Times New Roman"/>
-          <w:sz w:val="24"/>
-          <w:szCs w:val="24"/>
-        </w:rPr>
-        <w:t>a propuesta de solución.</w:t>
-      </w:r>
+      <w:bookmarkEnd w:id="16"/>
+    </w:p>
+    <w:p>
+      <w:pPr>
+        <w:pStyle w:val="Ttulo3"/>
+        <w:rPr>
+          <w:lang w:val="en-US"/>
+        </w:rPr>
+      </w:pPr>
+      <w:r>
+        <w:rPr>
+          <w:lang w:val="en-US"/>
+        </w:rPr>
+        <w:t xml:space="preserve"> </w:t>
+      </w:r>
+      <w:bookmarkStart w:id="17" w:name="_Toc232757481"/>
+      <w:r>
+        <w:rPr>
+          <w:lang w:val="en-US"/>
+        </w:rPr>
+        <w:t>Front – End (HTML, CSS, JS)</w:t>
+      </w:r>
+      <w:bookmarkEnd w:id="17"/>
+      <w:r>
+        <w:rPr>
+          <w:lang w:val="en-US"/>
+        </w:rPr>
+        <w:t xml:space="preserve"> </w:t>
+      </w:r>
+    </w:p>
+    <w:p>
+      <w:pPr>
+        <w:pStyle w:val="Ttulo3"/>
+        <w:rPr>
+          <w:lang w:val="en-US"/>
+        </w:rPr>
+      </w:pPr>
+      <w:r>
+        <w:rPr>
+          <w:lang w:val="en-US"/>
+        </w:rPr>
+        <w:t xml:space="preserve"> </w:t>
+      </w:r>
+      <w:bookmarkStart w:id="18" w:name="_Toc232757482"/>
+      <w:r>
+        <w:rPr>
+          <w:lang w:val="en-US"/>
+        </w:rPr>
+        <w:t>Back – End (Node.js, Express)</w:t>
+      </w:r>
+      <w:bookmarkEnd w:id="18"/>
+      <w:r>
+        <w:rPr>
+          <w:lang w:val="en-US"/>
+        </w:rPr>
+        <w:t xml:space="preserve"> </w:t>
+      </w:r>
+    </w:p>
+    <w:p>
+      <w:pPr>
+        <w:pStyle w:val="Ttulo3"/>
+        <w:rPr>
+          <w:lang w:val="en-US"/>
+        </w:rPr>
+      </w:pPr>
+      <w:r>
+        <w:rPr>
+          <w:lang w:val="en-US"/>
+        </w:rPr>
+        <w:t xml:space="preserve"> </w:t>
+      </w:r>
+      <w:bookmarkStart w:id="19" w:name="_Toc232757483"/>
+      <w:r>
+        <w:rPr>
+          <w:lang w:val="en-US"/>
+        </w:rPr>
+        <w:t>Características implementadas</w:t>
+      </w:r>
+      <w:bookmarkEnd w:id="19"/>
     </w:p>
     <w:p>
       <w:pPr>
         <w:pStyle w:val="Ttulo2"/>
       </w:pPr>
-      <w:bookmarkStart w:id="13" w:name="_Toc232690662"/>
+      <w:bookmarkStart w:id="20" w:name="_Toc232757484"/>
       <w:r>
         <w:t>Buenas prácticas aplicadas</w:t>
       </w:r>
-      <w:bookmarkEnd w:id="13"/>
-    </w:p>
-    <w:p>
-      <w:pPr>
-        <w:pStyle w:val="Prrafodelista"/>
-        <w:spacing w:line="360" w:lineRule="auto"/>
-        <w:jc w:val="both"/>
-        <w:rPr>
-          <w:rFonts w:ascii="Times New Roman" w:hAnsi="Times New Roman" w:cs="Times New Roman"/>
-          <w:sz w:val="24"/>
-          <w:szCs w:val="24"/>
-        </w:rPr>
-      </w:pPr>
-      <w:r>
-        <w:rPr>
-          <w:rFonts w:ascii="Times New Roman" w:hAnsi="Times New Roman" w:cs="Times New Roman"/>
-          <w:sz w:val="24"/>
-          <w:szCs w:val="24"/>
-        </w:rPr>
-        <w:t xml:space="preserve">Describe </w:t>
-      </w:r>
-      <w:r>
-        <w:rPr>
-          <w:rFonts w:ascii="Times New Roman" w:hAnsi="Times New Roman" w:cs="Times New Roman"/>
-          <w:sz w:val="24"/>
-          <w:szCs w:val="24"/>
-        </w:rPr>
-        <w:t>de</w:t>
-      </w:r>
-      <w:r>
-        <w:rPr>
-          <w:rFonts w:ascii="Times New Roman" w:hAnsi="Times New Roman" w:cs="Times New Roman"/>
-          <w:sz w:val="24"/>
-          <w:szCs w:val="24"/>
-        </w:rPr>
-        <w:t xml:space="preserve"> 3 a 5 líneas el objetivo</w:t>
-      </w:r>
-      <w:r>
-        <w:rPr>
-          <w:rFonts w:ascii="Times New Roman" w:hAnsi="Times New Roman" w:cs="Times New Roman"/>
-          <w:sz w:val="24"/>
-          <w:szCs w:val="24"/>
-        </w:rPr>
-        <w:t xml:space="preserve"> de la propuesta de solución.</w:t>
-      </w:r>
-    </w:p>
+      <w:bookmarkEnd w:id="20"/>
+    </w:p>
+    <w:p>
+      <w:pPr>
+        <w:pStyle w:val="Ttulo3"/>
+      </w:pPr>
+      <w:r>
+        <w:t xml:space="preserve"> </w:t>
+      </w:r>
+      <w:bookmarkStart w:id="21" w:name="_Toc232757485"/>
+      <w:r>
+        <w:t>Accesibilidad</w:t>
+      </w:r>
+      <w:bookmarkEnd w:id="21"/>
+      <w:r>
+        <w:t xml:space="preserve"> </w:t>
+      </w:r>
+    </w:p>
+    <w:p>
+      <w:pPr>
+        <w:pStyle w:val="Ttulo3"/>
+      </w:pPr>
+      <w:r>
+        <w:t xml:space="preserve"> </w:t>
+      </w:r>
+      <w:bookmarkStart w:id="22" w:name="_Toc232757486"/>
+      <w:r>
+        <w:t>Privacidad</w:t>
+      </w:r>
+      <w:bookmarkEnd w:id="22"/>
+      <w:r>
+        <w:t xml:space="preserve"> </w:t>
+      </w:r>
+    </w:p>
+    <w:p>
+      <w:pPr>
+        <w:pStyle w:val="Ttulo3"/>
+      </w:pPr>
+      <w:r>
+        <w:lastRenderedPageBreak/>
+        <w:t xml:space="preserve"> </w:t>
+      </w:r>
+      <w:bookmarkStart w:id="23" w:name="_Toc232757487"/>
+      <w:r>
+        <w:t>Diseño Responsivo</w:t>
+      </w:r>
+      <w:bookmarkEnd w:id="23"/>
+      <w:r>
+        <w:t xml:space="preserve"> </w:t>
+      </w:r>
+    </w:p>
+    <w:p>
+      <w:pPr>
+        <w:pStyle w:val="Ttulo3"/>
+      </w:pPr>
+      <w:r>
+        <w:t xml:space="preserve"> </w:t>
+      </w:r>
+      <w:bookmarkStart w:id="24" w:name="_Toc232757488"/>
+      <w:r>
+        <w:t>Resultados de Valida</w:t>
+      </w:r>
+      <w:r>
+        <w:t xml:space="preserve">ción con </w:t>
+      </w:r>
+      <w:r>
+        <w:t>U</w:t>
+      </w:r>
+      <w:r>
+        <w:t>suarios</w:t>
+      </w:r>
+      <w:bookmarkEnd w:id="24"/>
+      <w:r>
+        <w:t xml:space="preserve"> </w:t>
+      </w:r>
+    </w:p>
+    <w:p/>
     <w:p>
       <w:pPr>
         <w:pStyle w:val="Prrafodelista"/>
@@ -4577,66 +6587,83 @@
       <w:pPr>
         <w:pStyle w:val="Ttulo1"/>
       </w:pPr>
-      <w:bookmarkStart w:id="14" w:name="_Toc232690663"/>
+      <w:bookmarkStart w:id="25" w:name="_Toc232757489"/>
       <w:r>
         <w:lastRenderedPageBreak/>
         <w:t>CAPÍTULO III</w:t>
       </w:r>
-      <w:bookmarkEnd w:id="14"/>
+      <w:bookmarkEnd w:id="25"/>
     </w:p>
     <w:p>
       <w:pPr>
         <w:pStyle w:val="Ttulo2"/>
       </w:pPr>
-      <w:bookmarkStart w:id="15" w:name="_Toc232690664"/>
+      <w:bookmarkStart w:id="26" w:name="_Toc232757490"/>
       <w:r>
         <w:t>Conclusiones y aprendizajes</w:t>
       </w:r>
-      <w:bookmarkEnd w:id="15"/>
-    </w:p>
-    <w:p>
-      <w:pPr>
-        <w:pStyle w:val="Prrafodelista"/>
-        <w:spacing w:line="360" w:lineRule="auto"/>
-        <w:jc w:val="both"/>
-        <w:rPr>
-          <w:rFonts w:ascii="Times New Roman" w:hAnsi="Times New Roman" w:cs="Times New Roman"/>
-          <w:sz w:val="24"/>
-          <w:szCs w:val="24"/>
-        </w:rPr>
-      </w:pPr>
-      <w:r>
-        <w:rPr>
-          <w:rFonts w:ascii="Times New Roman" w:hAnsi="Times New Roman" w:cs="Times New Roman"/>
-          <w:sz w:val="24"/>
-          <w:szCs w:val="24"/>
-        </w:rPr>
-        <w:t xml:space="preserve">Incluye las principales funciones, ubicaciones, </w:t>
-      </w:r>
-      <w:r>
-        <w:rPr>
-          <w:rFonts w:ascii="Times New Roman" w:hAnsi="Times New Roman" w:cs="Times New Roman"/>
-          <w:sz w:val="24"/>
-          <w:szCs w:val="24"/>
-        </w:rPr>
-        <w:t>dimensiones de cada elemento estructural</w:t>
-      </w:r>
-      <w:r>
-        <w:rPr>
-          <w:rFonts w:ascii="Times New Roman" w:hAnsi="Times New Roman" w:cs="Times New Roman"/>
-          <w:sz w:val="24"/>
-          <w:szCs w:val="24"/>
-        </w:rPr>
-        <w:t>.</w:t>
-      </w:r>
-      <w:r>
-        <w:rPr>
-          <w:rFonts w:ascii="Times New Roman" w:hAnsi="Times New Roman" w:cs="Times New Roman"/>
-          <w:sz w:val="24"/>
-          <w:szCs w:val="24"/>
-        </w:rPr>
-        <w:t xml:space="preserve"> Usa los contenidos del curso y un software de diseño matemático gráfico.</w:t>
-      </w:r>
+      <w:bookmarkEnd w:id="26"/>
+    </w:p>
+    <w:p>
+      <w:pPr>
+        <w:pStyle w:val="Ttulo3"/>
+      </w:pPr>
+      <w:r>
+        <w:t xml:space="preserve"> </w:t>
+      </w:r>
+      <w:bookmarkStart w:id="27" w:name="_Toc232757491"/>
+      <w:r>
+        <w:t>Reflexión técnica</w:t>
+      </w:r>
+      <w:bookmarkEnd w:id="27"/>
+      <w:r>
+        <w:t xml:space="preserve"> </w:t>
+      </w:r>
+    </w:p>
+    <w:p>
+      <w:pPr>
+        <w:pStyle w:val="Ttulo3"/>
+      </w:pPr>
+      <w:r>
+        <w:t xml:space="preserve"> </w:t>
+      </w:r>
+      <w:bookmarkStart w:id="28" w:name="_Toc232757492"/>
+      <w:r>
+        <w:t>Impacto Social</w:t>
+      </w:r>
+      <w:bookmarkEnd w:id="28"/>
+      <w:r>
+        <w:t xml:space="preserve"> </w:t>
+      </w:r>
+    </w:p>
+    <w:p>
+      <w:pPr>
+        <w:pStyle w:val="Ttulo3"/>
+      </w:pPr>
+      <w:r>
+        <w:t xml:space="preserve"> </w:t>
+      </w:r>
+      <w:bookmarkStart w:id="29" w:name="_Toc232757493"/>
+      <w:r>
+        <w:t>Lecciones aprendidas</w:t>
+      </w:r>
+      <w:bookmarkEnd w:id="29"/>
+      <w:r>
+        <w:t xml:space="preserve"> </w:t>
+      </w:r>
+    </w:p>
+    <w:p>
+      <w:pPr>
+        <w:pStyle w:val="Ttulo3"/>
+      </w:pPr>
+      <w:r>
+        <w:t xml:space="preserve"> </w:t>
+      </w:r>
+      <w:bookmarkStart w:id="30" w:name="_Toc232757494"/>
+      <w:r>
+        <w:t>Mejoras futuras</w:t>
+      </w:r>
+      <w:bookmarkEnd w:id="30"/>
     </w:p>
     <w:p>
       <w:pPr>

</xml_diff>